<commit_message>
refactorizacion completa del proyecto
</commit_message>
<xml_diff>
--- a/inputs/plantilla_horas.docx
+++ b/inputs/plantilla_horas.docx
@@ -11,6 +11,7 @@
           <w:b/>
           <w:sz w:val="40"/>
           <w:szCs w:val="40"/>
+          <w:lang w:val="es-AR"/>
         </w:rPr>
       </w:pPr>
       <w:r>
@@ -19,6 +20,7 @@
           <w:b/>
           <w:sz w:val="40"/>
           <w:szCs w:val="40"/>
+          <w:lang w:val="es-AR"/>
         </w:rPr>
         <w:t xml:space="preserve">INFORME </w:t>
       </w:r>
@@ -28,6 +30,7 @@
           <w:b/>
           <w:sz w:val="40"/>
           <w:szCs w:val="40"/>
+          <w:lang w:val="es-AR"/>
         </w:rPr>
         <w:t>MENSUAL</w:t>
       </w:r>
@@ -37,6 +40,7 @@
           <w:b/>
           <w:sz w:val="40"/>
           <w:szCs w:val="40"/>
+          <w:lang w:val="es-AR"/>
         </w:rPr>
         <w:t xml:space="preserve"> </w:t>
       </w:r>
@@ -46,8 +50,9 @@
           <w:b/>
           <w:sz w:val="40"/>
           <w:szCs w:val="40"/>
-        </w:rPr>
-        <w:t xml:space="preserve">{{ </w:t>
+          <w:lang w:val="es-AR"/>
+        </w:rPr>
+        <w:t>{{</w:t>
       </w:r>
       <w:r>
         <w:rPr>
@@ -55,6 +60,7 @@
           <w:b/>
           <w:sz w:val="40"/>
           <w:szCs w:val="40"/>
+          <w:lang w:val="es-AR"/>
         </w:rPr>
         <w:t>periodo</w:t>
       </w:r>
@@ -64,361 +70,225 @@
           <w:b/>
           <w:sz w:val="40"/>
           <w:szCs w:val="40"/>
-        </w:rPr>
-        <w:t xml:space="preserve"> }}</w:t>
-      </w:r>
+          <w:lang w:val="es-AR"/>
+        </w:rPr>
+        <w:t>}}</w:t>
+      </w:r>
+    </w:p>
+    <w:p>
+      <w:pPr>
+        <w:spacing w:after="0"/>
+        <w:rPr>
+          <w:rFonts w:ascii="Mulish" w:hAnsi="Mulish"/>
+          <w:sz w:val="28"/>
+          <w:szCs w:val="28"/>
+          <w:lang w:val="es-AR"/>
+        </w:rPr>
+      </w:pPr>
+      <w:r>
+        <w:rPr>
+          <w:rFonts w:ascii="Mulish" w:hAnsi="Mulish"/>
+          <w:b/>
+          <w:bCs/>
+          <w:sz w:val="28"/>
+          <w:szCs w:val="28"/>
+          <w:lang w:val="es-AR"/>
+        </w:rPr>
+        <w:t>Agente:</w:t>
+      </w:r>
+      <w:r>
+        <w:rPr>
+          <w:rFonts w:ascii="Mulish" w:hAnsi="Mulish"/>
+          <w:sz w:val="28"/>
+          <w:szCs w:val="28"/>
+          <w:lang w:val="es-AR"/>
+        </w:rPr>
+        <w:t xml:space="preserve"> {{</w:t>
+      </w:r>
+      <w:proofErr w:type="spellStart"/>
+      <w:r>
+        <w:rPr>
+          <w:rFonts w:ascii="Mulish" w:hAnsi="Mulish"/>
+          <w:sz w:val="28"/>
+          <w:szCs w:val="28"/>
+          <w:lang w:val="es-AR"/>
+        </w:rPr>
+        <w:t>nombre_empleado</w:t>
+      </w:r>
+      <w:proofErr w:type="spellEnd"/>
+      <w:r>
+        <w:rPr>
+          <w:rFonts w:ascii="Mulish" w:hAnsi="Mulish"/>
+          <w:sz w:val="28"/>
+          <w:szCs w:val="28"/>
+          <w:lang w:val="es-AR"/>
+        </w:rPr>
+        <w:t>}}</w:t>
+      </w:r>
+    </w:p>
+    <w:p>
+      <w:pPr>
+        <w:spacing w:after="0"/>
+        <w:rPr>
+          <w:rFonts w:ascii="Mulish" w:hAnsi="Mulish"/>
+          <w:sz w:val="28"/>
+          <w:szCs w:val="28"/>
+          <w:lang w:val="es-AR"/>
+        </w:rPr>
+      </w:pPr>
+      <w:r>
+        <w:rPr>
+          <w:rFonts w:ascii="Mulish" w:hAnsi="Mulish"/>
+          <w:b/>
+          <w:bCs/>
+          <w:sz w:val="28"/>
+          <w:szCs w:val="28"/>
+          <w:lang w:val="es-AR"/>
+        </w:rPr>
+        <w:t>Horas Trabajadas:</w:t>
+      </w:r>
+      <w:r>
+        <w:rPr>
+          <w:rFonts w:ascii="Mulish" w:hAnsi="Mulish"/>
+          <w:sz w:val="28"/>
+          <w:szCs w:val="28"/>
+          <w:lang w:val="es-AR"/>
+        </w:rPr>
+        <w:t xml:space="preserve"> {{</w:t>
+      </w:r>
+      <w:proofErr w:type="spellStart"/>
+      <w:r>
+        <w:rPr>
+          <w:rFonts w:ascii="Mulish" w:hAnsi="Mulish"/>
+          <w:sz w:val="28"/>
+          <w:szCs w:val="28"/>
+          <w:lang w:val="es-AR"/>
+        </w:rPr>
+        <w:t>horas_trabajadas</w:t>
+      </w:r>
+      <w:proofErr w:type="spellEnd"/>
+      <w:r>
+        <w:rPr>
+          <w:rFonts w:ascii="Mulish" w:hAnsi="Mulish"/>
+          <w:sz w:val="28"/>
+          <w:szCs w:val="28"/>
+          <w:lang w:val="es-AR"/>
+        </w:rPr>
+        <w:t>}}</w:t>
+      </w:r>
+    </w:p>
+    <w:p>
+      <w:pPr>
+        <w:spacing w:after="0"/>
+        <w:rPr>
+          <w:rFonts w:ascii="Mulish" w:hAnsi="Mulish"/>
+          <w:sz w:val="28"/>
+          <w:szCs w:val="28"/>
+          <w:lang w:val="es-AR"/>
+        </w:rPr>
+      </w:pPr>
+      <w:r>
+        <w:rPr>
+          <w:rFonts w:ascii="Mulish" w:hAnsi="Mulish"/>
+          <w:b/>
+          <w:bCs/>
+          <w:sz w:val="28"/>
+          <w:szCs w:val="28"/>
+          <w:lang w:val="es-AR"/>
+        </w:rPr>
+        <w:t>Horas Mínimas por Trabajar:</w:t>
+      </w:r>
+      <w:r>
+        <w:rPr>
+          <w:rFonts w:ascii="Mulish" w:hAnsi="Mulish"/>
+          <w:sz w:val="28"/>
+          <w:szCs w:val="28"/>
+          <w:lang w:val="es-AR"/>
+        </w:rPr>
+        <w:t xml:space="preserve"> {{</w:t>
+      </w:r>
+      <w:proofErr w:type="spellStart"/>
+      <w:r>
+        <w:rPr>
+          <w:rFonts w:ascii="Mulish" w:hAnsi="Mulish"/>
+          <w:sz w:val="28"/>
+          <w:szCs w:val="28"/>
+          <w:lang w:val="es-AR"/>
+        </w:rPr>
+        <w:t>horas_minimas</w:t>
+      </w:r>
+      <w:proofErr w:type="spellEnd"/>
+      <w:r>
+        <w:rPr>
+          <w:rFonts w:ascii="Mulish" w:hAnsi="Mulish"/>
+          <w:sz w:val="28"/>
+          <w:szCs w:val="28"/>
+          <w:lang w:val="es-AR"/>
+        </w:rPr>
+        <w:t>}}</w:t>
+      </w:r>
+    </w:p>
+    <w:p>
+      <w:pPr>
+        <w:spacing w:after="0"/>
+        <w:rPr>
+          <w:rFonts w:ascii="Mulish" w:hAnsi="Mulish"/>
+          <w:sz w:val="28"/>
+          <w:szCs w:val="28"/>
+          <w:lang w:val="es-AR"/>
+        </w:rPr>
+      </w:pPr>
+      <w:r>
+        <w:rPr>
+          <w:rFonts w:ascii="Mulish" w:hAnsi="Mulish"/>
+          <w:b/>
+          <w:bCs/>
+          <w:sz w:val="28"/>
+          <w:szCs w:val="28"/>
+          <w:lang w:val="es-AR"/>
+        </w:rPr>
+        <w:t>Diferencia:</w:t>
+      </w:r>
+      <w:r>
+        <w:rPr>
+          <w:rFonts w:ascii="Mulish" w:hAnsi="Mulish"/>
+          <w:sz w:val="28"/>
+          <w:szCs w:val="28"/>
+          <w:lang w:val="es-AR"/>
+        </w:rPr>
+        <w:t xml:space="preserve"> {{diferencia}}</w:t>
+      </w:r>
+    </w:p>
+    <w:p>
+      <w:pPr>
+        <w:spacing w:after="0"/>
+        <w:rPr>
+          <w:rFonts w:ascii="Mulish" w:hAnsi="Mulish"/>
+          <w:lang w:val="es-AR"/>
+        </w:rPr>
+      </w:pPr>
     </w:p>
     <w:tbl>
       <w:tblPr>
         <w:tblStyle w:val="Tablaconcuadrcula"/>
-        <w:tblW w:w="5000" w:type="pct"/>
-        <w:tblInd w:w="-5" w:type="dxa"/>
-        <w:tblBorders>
-          <w:top w:val="none" w:sz="0" w:space="0" w:color="auto"/>
-          <w:left w:val="none" w:sz="0" w:space="0" w:color="auto"/>
-          <w:bottom w:val="none" w:sz="0" w:space="0" w:color="auto"/>
-          <w:right w:val="none" w:sz="0" w:space="0" w:color="auto"/>
-          <w:insideH w:val="none" w:sz="0" w:space="0" w:color="auto"/>
-          <w:insideV w:val="none" w:sz="0" w:space="0" w:color="auto"/>
-        </w:tblBorders>
+        <w:tblpPr w:leftFromText="141" w:rightFromText="141" w:vertAnchor="text" w:horzAnchor="margin" w:tblpY="12"/>
+        <w:tblW w:w="5001" w:type="pct"/>
         <w:tblLook w:val="04A0" w:firstRow="1" w:lastRow="0" w:firstColumn="1" w:lastColumn="0" w:noHBand="0" w:noVBand="1"/>
       </w:tblPr>
       <w:tblGrid>
-        <w:gridCol w:w="8223"/>
-        <w:gridCol w:w="5781"/>
+        <w:gridCol w:w="1579"/>
+        <w:gridCol w:w="1780"/>
+        <w:gridCol w:w="1595"/>
+        <w:gridCol w:w="2260"/>
+        <w:gridCol w:w="3126"/>
       </w:tblGrid>
       <w:tr>
         <w:trPr>
-          <w:trHeight w:val="1474"/>
+          <w:trHeight w:val="70"/>
         </w:trPr>
         <w:tc>
           <w:tcPr>
-            <w:tcW w:w="2936" w:type="pct"/>
-            <w:vAlign w:val="bottom"/>
-          </w:tcPr>
-          <w:p>
-            <w:pPr>
-              <w:spacing w:after="120"/>
-              <w:ind w:left="-109"/>
-              <w:rPr>
-                <w:rFonts w:ascii="Mulish" w:hAnsi="Mulish"/>
-                <w:b/>
-                <w:sz w:val="28"/>
-                <w:szCs w:val="28"/>
-              </w:rPr>
-            </w:pPr>
-            <w:r>
-              <w:rPr>
-                <w:rFonts w:ascii="Mulish" w:hAnsi="Mulish"/>
-                <w:b/>
-                <w:sz w:val="28"/>
-                <w:szCs w:val="28"/>
-              </w:rPr>
-              <w:t>Empleado</w:t>
-            </w:r>
-            <w:r>
-              <w:rPr>
-                <w:rFonts w:ascii="Mulish" w:hAnsi="Mulish"/>
-                <w:b/>
-                <w:sz w:val="28"/>
-                <w:szCs w:val="28"/>
-              </w:rPr>
-              <w:t xml:space="preserve">/a: </w:t>
-            </w:r>
-            <w:r>
-              <w:rPr>
-                <w:rFonts w:ascii="Mulish" w:hAnsi="Mulish"/>
-                <w:sz w:val="28"/>
-                <w:szCs w:val="28"/>
-              </w:rPr>
-              <w:t>{{</w:t>
-            </w:r>
-            <w:r>
-              <w:rPr>
-                <w:rFonts w:ascii="Mulish" w:hAnsi="Mulish"/>
-                <w:sz w:val="28"/>
-                <w:szCs w:val="28"/>
-              </w:rPr>
-              <w:t xml:space="preserve"> </w:t>
-            </w:r>
-            <w:r>
-              <w:rPr>
-                <w:rFonts w:ascii="Mulish" w:hAnsi="Mulish"/>
-                <w:sz w:val="28"/>
-                <w:szCs w:val="28"/>
-              </w:rPr>
-              <w:t>nombre_</w:t>
-            </w:r>
-            <w:r>
-              <w:rPr>
-                <w:rFonts w:ascii="Mulish" w:hAnsi="Mulish"/>
-                <w:sz w:val="28"/>
-                <w:szCs w:val="28"/>
-              </w:rPr>
-              <w:t>empleado</w:t>
-            </w:r>
-            <w:r>
-              <w:rPr>
-                <w:rFonts w:ascii="Mulish" w:hAnsi="Mulish"/>
-                <w:sz w:val="28"/>
-                <w:szCs w:val="28"/>
-              </w:rPr>
-              <w:t xml:space="preserve"> </w:t>
-            </w:r>
-            <w:r>
-              <w:rPr>
-                <w:rFonts w:ascii="Mulish" w:hAnsi="Mulish"/>
-                <w:sz w:val="28"/>
-                <w:szCs w:val="28"/>
-              </w:rPr>
-              <w:t>}}</w:t>
-            </w:r>
-          </w:p>
-        </w:tc>
-        <w:tc>
-          <w:tcPr>
-            <w:tcW w:w="2064" w:type="pct"/>
-            <w:vMerge w:val="restart"/>
-            <w:vAlign w:val="center"/>
-          </w:tcPr>
-          <w:p>
-            <w:pPr>
-              <w:jc w:val="center"/>
-              <w:rPr>
-                <w:rFonts w:ascii="Mulish" w:hAnsi="Mulish"/>
-                <w:sz w:val="28"/>
-                <w:szCs w:val="28"/>
-              </w:rPr>
-            </w:pPr>
-          </w:p>
-        </w:tc>
-      </w:tr>
-      <w:tr>
-        <w:trPr>
-          <w:trHeight w:val="454"/>
-        </w:trPr>
-        <w:tc>
-          <w:tcPr>
-            <w:tcW w:w="2936" w:type="pct"/>
-            <w:vAlign w:val="bottom"/>
-          </w:tcPr>
-          <w:p>
-            <w:pPr>
-              <w:spacing w:after="120"/>
-              <w:ind w:left="-109"/>
-              <w:rPr>
-                <w:rFonts w:ascii="Mulish" w:hAnsi="Mulish"/>
-                <w:b/>
-                <w:sz w:val="28"/>
-                <w:szCs w:val="28"/>
-              </w:rPr>
-            </w:pPr>
-            <w:r>
-              <w:rPr>
-                <w:rFonts w:ascii="Mulish" w:hAnsi="Mulish"/>
-                <w:b/>
-                <w:sz w:val="28"/>
-                <w:szCs w:val="28"/>
-              </w:rPr>
-              <w:t>Horas Trabajadas</w:t>
-            </w:r>
-            <w:r>
-              <w:rPr>
-                <w:rFonts w:ascii="Mulish" w:hAnsi="Mulish"/>
-                <w:b/>
-                <w:sz w:val="28"/>
-                <w:szCs w:val="28"/>
-              </w:rPr>
-              <w:t xml:space="preserve">: </w:t>
-            </w:r>
-            <w:r>
-              <w:rPr>
-                <w:rFonts w:ascii="Mulish" w:hAnsi="Mulish"/>
-                <w:sz w:val="28"/>
-                <w:szCs w:val="28"/>
-              </w:rPr>
-              <w:t>{{ horas_trabajadas }}</w:t>
-            </w:r>
-          </w:p>
-        </w:tc>
-        <w:tc>
-          <w:tcPr>
-            <w:tcW w:w="2064" w:type="pct"/>
-            <w:vMerge/>
-            <w:vAlign w:val="center"/>
-          </w:tcPr>
-          <w:p>
-            <w:pPr>
-              <w:jc w:val="right"/>
-              <w:rPr>
-                <w:rFonts w:ascii="Mulish" w:hAnsi="Mulish"/>
-                <w:noProof/>
-              </w:rPr>
-            </w:pPr>
-          </w:p>
-        </w:tc>
-      </w:tr>
-      <w:tr>
-        <w:trPr>
-          <w:trHeight w:val="454"/>
-        </w:trPr>
-        <w:tc>
-          <w:tcPr>
-            <w:tcW w:w="2936" w:type="pct"/>
-            <w:vAlign w:val="bottom"/>
-          </w:tcPr>
-          <w:p>
-            <w:pPr>
-              <w:spacing w:after="120"/>
-              <w:ind w:left="-109"/>
-              <w:rPr>
-                <w:rFonts w:ascii="Mulish" w:hAnsi="Mulish"/>
-                <w:b/>
-                <w:sz w:val="28"/>
-                <w:szCs w:val="28"/>
-              </w:rPr>
-            </w:pPr>
-            <w:r>
-              <w:rPr>
-                <w:rFonts w:ascii="Mulish" w:hAnsi="Mulish"/>
-                <w:b/>
-                <w:sz w:val="28"/>
-                <w:szCs w:val="28"/>
-              </w:rPr>
-              <w:t xml:space="preserve">Horas Mínimas </w:t>
-            </w:r>
-            <w:r>
-              <w:rPr>
-                <w:rFonts w:ascii="Mulish" w:hAnsi="Mulish"/>
-                <w:b/>
-                <w:sz w:val="28"/>
-                <w:szCs w:val="28"/>
-              </w:rPr>
-              <w:t>por</w:t>
-            </w:r>
-            <w:r>
-              <w:rPr>
-                <w:rFonts w:ascii="Mulish" w:hAnsi="Mulish"/>
-                <w:b/>
-                <w:sz w:val="28"/>
-                <w:szCs w:val="28"/>
-              </w:rPr>
-              <w:t xml:space="preserve"> Trabajar</w:t>
-            </w:r>
-            <w:r>
-              <w:rPr>
-                <w:rFonts w:ascii="Mulish" w:hAnsi="Mulish"/>
-                <w:b/>
-                <w:sz w:val="28"/>
-                <w:szCs w:val="28"/>
-              </w:rPr>
-              <w:t xml:space="preserve">: </w:t>
-            </w:r>
-            <w:r>
-              <w:rPr>
-                <w:rFonts w:ascii="Mulish" w:hAnsi="Mulish"/>
-                <w:sz w:val="28"/>
-                <w:szCs w:val="28"/>
-              </w:rPr>
-              <w:t xml:space="preserve">{{ </w:t>
-            </w:r>
-            <w:r>
-              <w:rPr>
-                <w:rFonts w:ascii="Mulish" w:hAnsi="Mulish"/>
-                <w:sz w:val="28"/>
-                <w:szCs w:val="28"/>
-              </w:rPr>
-              <w:t xml:space="preserve">horas_minimas </w:t>
-            </w:r>
-            <w:r>
-              <w:rPr>
-                <w:rFonts w:ascii="Mulish" w:hAnsi="Mulish"/>
-                <w:sz w:val="28"/>
-                <w:szCs w:val="28"/>
-              </w:rPr>
-              <w:t>}}</w:t>
-            </w:r>
-          </w:p>
-        </w:tc>
-        <w:tc>
-          <w:tcPr>
-            <w:tcW w:w="2064" w:type="pct"/>
-            <w:vMerge/>
-            <w:vAlign w:val="center"/>
-          </w:tcPr>
-          <w:p>
-            <w:pPr>
-              <w:spacing w:after="120"/>
-              <w:jc w:val="center"/>
-              <w:rPr>
-                <w:rFonts w:ascii="Mulish" w:hAnsi="Mulish"/>
-                <w:sz w:val="28"/>
-                <w:szCs w:val="28"/>
-              </w:rPr>
-            </w:pPr>
-          </w:p>
-        </w:tc>
-      </w:tr>
-      <w:tr>
-        <w:trPr>
-          <w:trHeight w:val="160"/>
-        </w:trPr>
-        <w:tc>
-          <w:tcPr>
-            <w:tcW w:w="2936" w:type="pct"/>
-          </w:tcPr>
-          <w:p>
-            <w:pPr>
-              <w:spacing w:after="120"/>
-              <w:rPr>
-                <w:rFonts w:ascii="Mulish" w:hAnsi="Mulish"/>
-                <w:b/>
-                <w:sz w:val="28"/>
-                <w:szCs w:val="28"/>
-              </w:rPr>
-            </w:pPr>
-          </w:p>
-        </w:tc>
-        <w:tc>
-          <w:tcPr>
-            <w:tcW w:w="2064" w:type="pct"/>
-            <w:vMerge/>
-          </w:tcPr>
-          <w:p>
-            <w:pPr>
-              <w:spacing w:after="120"/>
-              <w:rPr>
-                <w:rFonts w:ascii="Mulish" w:hAnsi="Mulish"/>
-                <w:b/>
-                <w:sz w:val="28"/>
-                <w:szCs w:val="28"/>
-              </w:rPr>
-            </w:pPr>
-          </w:p>
-        </w:tc>
-      </w:tr>
-    </w:tbl>
-    <w:tbl>
-      <w:tblPr>
-        <w:tblStyle w:val="Tablaconcuadrcula"/>
-        <w:tblpPr w:leftFromText="141" w:rightFromText="141" w:vertAnchor="text" w:horzAnchor="margin" w:tblpY="12"/>
-        <w:tblW w:w="5000" w:type="pct"/>
-        <w:tblLook w:val="04A0" w:firstRow="1" w:lastRow="0" w:firstColumn="1" w:lastColumn="0" w:noHBand="0" w:noVBand="1"/>
-      </w:tblPr>
-      <w:tblGrid>
-        <w:gridCol w:w="1556"/>
-        <w:gridCol w:w="1699"/>
-        <w:gridCol w:w="1842"/>
-        <w:gridCol w:w="7232"/>
-        <w:gridCol w:w="1665"/>
-      </w:tblGrid>
-      <w:tr>
-        <w:trPr>
-          <w:trHeight w:val="737"/>
-        </w:trPr>
-        <w:tc>
-          <w:tcPr>
-            <w:tcW w:w="556" w:type="pct"/>
+            <w:tcW w:w="555" w:type="pct"/>
             <w:shd w:val="clear" w:color="auto" w:fill="F2F2F2" w:themeFill="background1" w:themeFillShade="F2"/>
             <w:vAlign w:val="center"/>
           </w:tcPr>
@@ -428,12 +298,14 @@
               <w:rPr>
                 <w:rFonts w:ascii="Mulish" w:hAnsi="Mulish"/>
                 <w:b/>
+                <w:lang w:val="es-AR"/>
               </w:rPr>
             </w:pPr>
             <w:r>
               <w:rPr>
                 <w:rFonts w:ascii="Mulish" w:hAnsi="Mulish"/>
                 <w:b/>
+                <w:lang w:val="es-AR"/>
               </w:rPr>
               <w:t>Fecha</w:t>
             </w:r>
@@ -441,7 +313,7 @@
         </w:tc>
         <w:tc>
           <w:tcPr>
-            <w:tcW w:w="607" w:type="pct"/>
+            <w:tcW w:w="608" w:type="pct"/>
             <w:shd w:val="clear" w:color="auto" w:fill="F2F2F2" w:themeFill="background1" w:themeFillShade="F2"/>
             <w:vAlign w:val="center"/>
           </w:tcPr>
@@ -451,12 +323,14 @@
               <w:rPr>
                 <w:rFonts w:ascii="Mulish" w:hAnsi="Mulish"/>
                 <w:b/>
+                <w:lang w:val="es-AR"/>
               </w:rPr>
             </w:pPr>
             <w:r>
               <w:rPr>
                 <w:rFonts w:ascii="Mulish" w:hAnsi="Mulish"/>
                 <w:b/>
+                <w:lang w:val="es-AR"/>
               </w:rPr>
               <w:t>Entrada</w:t>
             </w:r>
@@ -474,21 +348,16 @@
               <w:rPr>
                 <w:rFonts w:ascii="Mulish" w:hAnsi="Mulish"/>
                 <w:b/>
+                <w:lang w:val="es-AR"/>
               </w:rPr>
             </w:pPr>
             <w:r>
               <w:rPr>
                 <w:rFonts w:ascii="Mulish" w:hAnsi="Mulish"/>
                 <w:b/>
-              </w:rPr>
-              <w:t>S</w:t>
-            </w:r>
-            <w:r>
-              <w:rPr>
-                <w:rFonts w:ascii="Mulish" w:hAnsi="Mulish"/>
-                <w:b/>
-              </w:rPr>
-              <w:t>alida</w:t>
+                <w:lang w:val="es-AR"/>
+              </w:rPr>
+              <w:t>Salida</w:t>
             </w:r>
           </w:p>
         </w:tc>
@@ -504,12 +373,14 @@
               <w:rPr>
                 <w:rFonts w:ascii="Mulish" w:hAnsi="Mulish"/>
                 <w:b/>
+                <w:lang w:val="es-AR"/>
               </w:rPr>
             </w:pPr>
             <w:r>
               <w:rPr>
                 <w:rFonts w:ascii="Mulish" w:hAnsi="Mulish"/>
                 <w:b/>
+                <w:lang w:val="es-AR"/>
               </w:rPr>
               <w:t>Detalle</w:t>
             </w:r>
@@ -527,12 +398,14 @@
               <w:rPr>
                 <w:rFonts w:ascii="Mulish" w:hAnsi="Mulish"/>
                 <w:b/>
+                <w:lang w:val="es-AR"/>
               </w:rPr>
             </w:pPr>
             <w:r>
               <w:rPr>
                 <w:rFonts w:ascii="Mulish" w:hAnsi="Mulish"/>
                 <w:b/>
+                <w:lang w:val="es-AR"/>
               </w:rPr>
               <w:t>Trabajó</w:t>
             </w:r>
@@ -554,48 +427,88 @@
               <w:rPr>
                 <w:rFonts w:ascii="Mulish" w:hAnsi="Mulish"/>
                 <w:color w:val="000000" w:themeColor="text1"/>
-                <w:lang w:val="en-US"/>
+                <w:lang w:val="es-AR"/>
               </w:rPr>
             </w:pPr>
             <w:r>
               <w:rPr>
                 <w:rFonts w:ascii="Mulish" w:hAnsi="Mulish"/>
                 <w:color w:val="000000" w:themeColor="text1"/>
-                <w:lang w:val="en-US"/>
-              </w:rPr>
-              <w:t xml:space="preserve">{%tr for </w:t>
-            </w:r>
+                <w:lang w:val="es-AR"/>
+              </w:rPr>
+              <w:t>{%</w:t>
+            </w:r>
+            <w:proofErr w:type="spellStart"/>
             <w:r>
               <w:rPr>
                 <w:rFonts w:ascii="Mulish" w:hAnsi="Mulish"/>
                 <w:color w:val="000000" w:themeColor="text1"/>
-                <w:lang w:val="en-US"/>
+                <w:lang w:val="es-AR"/>
+              </w:rPr>
+              <w:t>tr</w:t>
+            </w:r>
+            <w:proofErr w:type="spellEnd"/>
+            <w:r>
+              <w:rPr>
+                <w:rFonts w:ascii="Mulish" w:hAnsi="Mulish"/>
+                <w:color w:val="000000" w:themeColor="text1"/>
+                <w:lang w:val="es-AR"/>
+              </w:rPr>
+              <w:t xml:space="preserve"> </w:t>
+            </w:r>
+            <w:proofErr w:type="spellStart"/>
+            <w:r>
+              <w:rPr>
+                <w:rFonts w:ascii="Mulish" w:hAnsi="Mulish"/>
+                <w:color w:val="000000" w:themeColor="text1"/>
+                <w:lang w:val="es-AR"/>
+              </w:rPr>
+              <w:t>for</w:t>
+            </w:r>
+            <w:proofErr w:type="spellEnd"/>
+            <w:r>
+              <w:rPr>
+                <w:rFonts w:ascii="Mulish" w:hAnsi="Mulish"/>
+                <w:color w:val="000000" w:themeColor="text1"/>
+                <w:lang w:val="es-AR"/>
+              </w:rPr>
+              <w:t xml:space="preserve"> </w:t>
+            </w:r>
+            <w:proofErr w:type="spellStart"/>
+            <w:r>
+              <w:rPr>
+                <w:rFonts w:ascii="Mulish" w:hAnsi="Mulish"/>
+                <w:color w:val="000000" w:themeColor="text1"/>
+                <w:lang w:val="es-AR"/>
               </w:rPr>
               <w:t>item</w:t>
             </w:r>
+            <w:proofErr w:type="spellEnd"/>
             <w:r>
               <w:rPr>
                 <w:rFonts w:ascii="Mulish" w:hAnsi="Mulish"/>
                 <w:color w:val="000000" w:themeColor="text1"/>
-                <w:lang w:val="en-US"/>
+                <w:lang w:val="es-AR"/>
               </w:rPr>
               <w:t xml:space="preserve"> in </w:t>
             </w:r>
+            <w:proofErr w:type="spellStart"/>
             <w:r>
               <w:rPr>
                 <w:rFonts w:ascii="Mulish" w:hAnsi="Mulish"/>
                 <w:color w:val="000000" w:themeColor="text1"/>
-                <w:lang w:val="en-US"/>
-              </w:rPr>
-              <w:t>horas_trabajadas</w:t>
-            </w:r>
+                <w:lang w:val="es-AR"/>
+              </w:rPr>
+              <w:t>horas_trabajadas_list</w:t>
+            </w:r>
+            <w:proofErr w:type="spellEnd"/>
             <w:r>
               <w:rPr>
                 <w:rFonts w:ascii="Mulish" w:hAnsi="Mulish"/>
                 <w:color w:val="000000" w:themeColor="text1"/>
-                <w:lang w:val="en-US"/>
-              </w:rPr>
-              <w:t>_list %}</w:t>
+                <w:lang w:val="es-AR"/>
+              </w:rPr>
+              <w:t xml:space="preserve"> %}</w:t>
             </w:r>
           </w:p>
         </w:tc>
@@ -603,7 +516,7 @@
       <w:tr>
         <w:tc>
           <w:tcPr>
-            <w:tcW w:w="556" w:type="pct"/>
+            <w:tcW w:w="555" w:type="pct"/>
             <w:vAlign w:val="center"/>
           </w:tcPr>
           <w:p>
@@ -611,30 +524,39 @@
               <w:jc w:val="center"/>
               <w:rPr>
                 <w:rFonts w:ascii="Mulish" w:hAnsi="Mulish"/>
-                <w:lang w:val="en-US"/>
+                <w:lang w:val="es-AR"/>
               </w:rPr>
             </w:pPr>
+            <w:r>
+              <w:rPr>
+                <w:rFonts w:ascii="Mulish" w:hAnsi="Mulish"/>
+                <w:lang w:val="es-AR"/>
+              </w:rPr>
+              <w:t>{{</w:t>
+            </w:r>
+            <w:proofErr w:type="spellStart"/>
             <w:proofErr w:type="gramStart"/>
             <w:r>
               <w:rPr>
                 <w:rFonts w:ascii="Mulish" w:hAnsi="Mulish"/>
-                <w:lang w:val="en-US"/>
-              </w:rPr>
-              <w:t>{{ item</w:t>
-            </w:r>
+                <w:lang w:val="es-AR"/>
+              </w:rPr>
+              <w:t>item.Fecha</w:t>
+            </w:r>
+            <w:proofErr w:type="spellEnd"/>
             <w:proofErr w:type="gramEnd"/>
             <w:r>
               <w:rPr>
                 <w:rFonts w:ascii="Mulish" w:hAnsi="Mulish"/>
-                <w:lang w:val="en-US"/>
-              </w:rPr>
-              <w:t>.Fecha }}</w:t>
+                <w:lang w:val="es-AR"/>
+              </w:rPr>
+              <w:t>}}</w:t>
             </w:r>
           </w:p>
         </w:tc>
         <w:tc>
           <w:tcPr>
-            <w:tcW w:w="607" w:type="pct"/>
+            <w:tcW w:w="608" w:type="pct"/>
             <w:vAlign w:val="center"/>
           </w:tcPr>
           <w:p>
@@ -642,15 +564,33 @@
               <w:jc w:val="center"/>
               <w:rPr>
                 <w:rFonts w:ascii="Mulish" w:hAnsi="Mulish"/>
-                <w:lang w:val="en-US"/>
+                <w:lang w:val="es-AR"/>
               </w:rPr>
             </w:pPr>
             <w:r>
               <w:rPr>
                 <w:rFonts w:ascii="Mulish" w:hAnsi="Mulish"/>
-                <w:lang w:val="en-US"/>
-              </w:rPr>
-              <w:t>{{ item.Entrada }}</w:t>
+                <w:lang w:val="es-AR"/>
+              </w:rPr>
+              <w:t>{{</w:t>
+            </w:r>
+            <w:proofErr w:type="spellStart"/>
+            <w:proofErr w:type="gramStart"/>
+            <w:r>
+              <w:rPr>
+                <w:rFonts w:ascii="Mulish" w:hAnsi="Mulish"/>
+                <w:lang w:val="es-AR"/>
+              </w:rPr>
+              <w:t>item.Entrada</w:t>
+            </w:r>
+            <w:proofErr w:type="spellEnd"/>
+            <w:proofErr w:type="gramEnd"/>
+            <w:r>
+              <w:rPr>
+                <w:rFonts w:ascii="Mulish" w:hAnsi="Mulish"/>
+                <w:lang w:val="es-AR"/>
+              </w:rPr>
+              <w:t>}}</w:t>
             </w:r>
           </w:p>
         </w:tc>
@@ -664,56 +604,72 @@
               <w:jc w:val="center"/>
               <w:rPr>
                 <w:rFonts w:ascii="Mulish" w:hAnsi="Mulish"/>
-                <w:lang w:val="en-US"/>
+                <w:lang w:val="es-AR"/>
               </w:rPr>
             </w:pPr>
+            <w:r>
+              <w:rPr>
+                <w:rFonts w:ascii="Mulish" w:hAnsi="Mulish"/>
+                <w:lang w:val="es-AR"/>
+              </w:rPr>
+              <w:t>{{</w:t>
+            </w:r>
+            <w:proofErr w:type="spellStart"/>
             <w:proofErr w:type="gramStart"/>
             <w:r>
               <w:rPr>
                 <w:rFonts w:ascii="Mulish" w:hAnsi="Mulish"/>
-                <w:lang w:val="en-US"/>
-              </w:rPr>
-              <w:t>{{ item</w:t>
-            </w:r>
+                <w:lang w:val="es-AR"/>
+              </w:rPr>
+              <w:t>item.Salida</w:t>
+            </w:r>
+            <w:proofErr w:type="spellEnd"/>
             <w:proofErr w:type="gramEnd"/>
             <w:r>
               <w:rPr>
                 <w:rFonts w:ascii="Mulish" w:hAnsi="Mulish"/>
-                <w:lang w:val="en-US"/>
-              </w:rPr>
-              <w:t>.Salida }}</w:t>
+                <w:lang w:val="es-AR"/>
+              </w:rPr>
+              <w:t>}}</w:t>
             </w:r>
           </w:p>
         </w:tc>
         <w:tc>
           <w:tcPr>
             <w:tcW w:w="2584" w:type="pct"/>
-            <w:shd w:val="clear" w:color="auto" w:fill="auto"/>
             <w:vAlign w:val="center"/>
           </w:tcPr>
           <w:p>
             <w:pPr>
-              <w:jc w:val="center"/>
-              <w:rPr>
-                <w:rFonts w:ascii="Mulish" w:hAnsi="Mulish"/>
-                <w:lang w:val="en-US"/>
+              <w:rPr>
+                <w:rFonts w:ascii="Mulish" w:hAnsi="Mulish"/>
+                <w:lang w:val="es-AR"/>
               </w:rPr>
             </w:pPr>
+            <w:r>
+              <w:rPr>
+                <w:rFonts w:ascii="Mulish" w:hAnsi="Mulish"/>
+                <w:lang w:val="es-AR"/>
+              </w:rPr>
+              <w:t>{{</w:t>
+            </w:r>
+            <w:proofErr w:type="spellStart"/>
             <w:proofErr w:type="gramStart"/>
             <w:r>
               <w:rPr>
                 <w:rFonts w:ascii="Mulish" w:hAnsi="Mulish"/>
-                <w:lang w:val="en-US"/>
-              </w:rPr>
-              <w:t>{{ item</w:t>
-            </w:r>
+                <w:lang w:val="es-AR"/>
+              </w:rPr>
+              <w:t>item.Detalle</w:t>
+            </w:r>
+            <w:proofErr w:type="spellEnd"/>
             <w:proofErr w:type="gramEnd"/>
             <w:r>
               <w:rPr>
                 <w:rFonts w:ascii="Mulish" w:hAnsi="Mulish"/>
-                <w:lang w:val="en-US"/>
-              </w:rPr>
-              <w:t>.Concepto }}</w:t>
+                <w:lang w:val="es-AR"/>
+              </w:rPr>
+              <w:t>}}</w:t>
             </w:r>
           </w:p>
         </w:tc>
@@ -723,7 +679,6 @@
             <w:tcBorders>
               <w:right w:val="single" w:sz="4" w:space="0" w:color="auto"/>
             </w:tcBorders>
-            <w:shd w:val="clear" w:color="auto" w:fill="auto"/>
             <w:vAlign w:val="center"/>
           </w:tcPr>
           <w:p>
@@ -732,24 +687,33 @@
               <w:rPr>
                 <w:rFonts w:ascii="Mulish" w:hAnsi="Mulish"/>
                 <w:color w:val="000000" w:themeColor="text1"/>
-                <w:lang w:val="en-US"/>
+                <w:lang w:val="es-AR"/>
               </w:rPr>
             </w:pPr>
+            <w:r>
+              <w:rPr>
+                <w:rFonts w:ascii="Mulish" w:hAnsi="Mulish"/>
+                <w:lang w:val="es-AR"/>
+              </w:rPr>
+              <w:t>{{</w:t>
+            </w:r>
+            <w:proofErr w:type="spellStart"/>
             <w:proofErr w:type="gramStart"/>
             <w:r>
               <w:rPr>
                 <w:rFonts w:ascii="Mulish" w:hAnsi="Mulish"/>
-                <w:lang w:val="en-US"/>
-              </w:rPr>
-              <w:t>{{ item</w:t>
-            </w:r>
+                <w:lang w:val="es-AR"/>
+              </w:rPr>
+              <w:t>item.Trabajo</w:t>
+            </w:r>
+            <w:proofErr w:type="spellEnd"/>
             <w:proofErr w:type="gramEnd"/>
             <w:r>
               <w:rPr>
                 <w:rFonts w:ascii="Mulish" w:hAnsi="Mulish"/>
-                <w:lang w:val="en-US"/>
-              </w:rPr>
-              <w:t>.Trabajo }}</w:t>
+                <w:lang w:val="es-AR"/>
+              </w:rPr>
+              <w:t>}}</w:t>
             </w:r>
           </w:p>
         </w:tc>
@@ -769,32 +733,180 @@
               <w:rPr>
                 <w:rFonts w:ascii="Mulish" w:hAnsi="Mulish"/>
                 <w:color w:val="000000" w:themeColor="text1"/>
-                <w:lang w:val="en-US"/>
+                <w:lang w:val="es-AR"/>
               </w:rPr>
             </w:pPr>
             <w:r>
               <w:rPr>
                 <w:rFonts w:ascii="Mulish" w:hAnsi="Mulish"/>
                 <w:color w:val="000000" w:themeColor="text1"/>
-                <w:lang w:val="en-US"/>
-              </w:rPr>
-              <w:t xml:space="preserve">{%tr </w:t>
-            </w:r>
+                <w:lang w:val="es-AR"/>
+              </w:rPr>
+              <w:t>{%</w:t>
+            </w:r>
+            <w:proofErr w:type="spellStart"/>
             <w:r>
               <w:rPr>
                 <w:rFonts w:ascii="Mulish" w:hAnsi="Mulish"/>
                 <w:color w:val="000000" w:themeColor="text1"/>
-                <w:lang w:val="en-US"/>
-              </w:rPr>
-              <w:t xml:space="preserve">endfor </w:t>
-            </w:r>
+                <w:lang w:val="es-AR"/>
+              </w:rPr>
+              <w:t>tr</w:t>
+            </w:r>
+            <w:proofErr w:type="spellEnd"/>
             <w:r>
               <w:rPr>
                 <w:rFonts w:ascii="Mulish" w:hAnsi="Mulish"/>
                 <w:color w:val="000000" w:themeColor="text1"/>
-                <w:lang w:val="en-US"/>
-              </w:rPr>
-              <w:t>%}</w:t>
+                <w:lang w:val="es-AR"/>
+              </w:rPr>
+              <w:t xml:space="preserve"> </w:t>
+            </w:r>
+            <w:proofErr w:type="spellStart"/>
+            <w:r>
+              <w:rPr>
+                <w:rFonts w:ascii="Mulish" w:hAnsi="Mulish"/>
+                <w:color w:val="000000" w:themeColor="text1"/>
+                <w:lang w:val="es-AR"/>
+              </w:rPr>
+              <w:t>endfor</w:t>
+            </w:r>
+            <w:proofErr w:type="spellEnd"/>
+            <w:r>
+              <w:rPr>
+                <w:rFonts w:ascii="Mulish" w:hAnsi="Mulish"/>
+                <w:color w:val="000000" w:themeColor="text1"/>
+                <w:lang w:val="es-AR"/>
+              </w:rPr>
+              <w:t xml:space="preserve"> %}</w:t>
+            </w:r>
+          </w:p>
+        </w:tc>
+      </w:tr>
+      <w:tr>
+        <w:tc>
+          <w:tcPr>
+            <w:tcW w:w="4454" w:type="pct"/>
+            <w:gridSpan w:val="4"/>
+            <w:tcBorders>
+              <w:right w:val="single" w:sz="4" w:space="0" w:color="auto"/>
+            </w:tcBorders>
+          </w:tcPr>
+          <w:p>
+            <w:pPr>
+              <w:jc w:val="right"/>
+              <w:rPr>
+                <w:rFonts w:ascii="Mulish" w:hAnsi="Mulish"/>
+                <w:color w:val="000000" w:themeColor="text1"/>
+                <w:lang w:val="es-AR"/>
+              </w:rPr>
+            </w:pPr>
+            <w:proofErr w:type="gramStart"/>
+            <w:r>
+              <w:rPr>
+                <w:rFonts w:ascii="Mulish" w:hAnsi="Mulish"/>
+                <w:b/>
+                <w:lang w:val="es-AR"/>
+              </w:rPr>
+              <w:t>TOTAL</w:t>
+            </w:r>
+            <w:proofErr w:type="gramEnd"/>
+            <w:r>
+              <w:rPr>
+                <w:rFonts w:ascii="Mulish" w:hAnsi="Mulish"/>
+                <w:b/>
+                <w:lang w:val="es-AR"/>
+              </w:rPr>
+              <w:t xml:space="preserve"> DE HORAS TRABAJADAS: </w:t>
+            </w:r>
+          </w:p>
+        </w:tc>
+        <w:tc>
+          <w:tcPr>
+            <w:tcW w:w="546" w:type="pct"/>
+            <w:tcBorders>
+              <w:right w:val="single" w:sz="4" w:space="0" w:color="auto"/>
+            </w:tcBorders>
+          </w:tcPr>
+          <w:p>
+            <w:pPr>
+              <w:jc w:val="center"/>
+              <w:rPr>
+                <w:rFonts w:ascii="Mulish" w:hAnsi="Mulish"/>
+                <w:b/>
+                <w:bCs/>
+                <w:color w:val="000000" w:themeColor="text1"/>
+                <w:lang w:val="es-AR"/>
+              </w:rPr>
+            </w:pPr>
+            <w:r>
+              <w:rPr>
+                <w:rFonts w:ascii="Mulish" w:hAnsi="Mulish"/>
+                <w:b/>
+                <w:bCs/>
+                <w:lang w:val="es-AR"/>
+              </w:rPr>
+              <w:t>{%</w:t>
+            </w:r>
+            <w:proofErr w:type="spellStart"/>
+            <w:r>
+              <w:rPr>
+                <w:rFonts w:ascii="Mulish" w:hAnsi="Mulish"/>
+                <w:b/>
+                <w:bCs/>
+                <w:lang w:val="es-AR"/>
+              </w:rPr>
+              <w:t>cellbg</w:t>
+            </w:r>
+            <w:proofErr w:type="spellEnd"/>
+            <w:r>
+              <w:rPr>
+                <w:rFonts w:ascii="Mulish" w:hAnsi="Mulish"/>
+                <w:b/>
+                <w:bCs/>
+                <w:lang w:val="es-AR"/>
+              </w:rPr>
+              <w:t xml:space="preserve"> color</w:t>
+            </w:r>
+            <w:proofErr w:type="gramStart"/>
+            <w:r>
+              <w:rPr>
+                <w:rFonts w:ascii="Mulish" w:hAnsi="Mulish"/>
+                <w:b/>
+                <w:bCs/>
+                <w:lang w:val="es-AR"/>
+              </w:rPr>
+              <w:t>%}{</w:t>
+            </w:r>
+            <w:proofErr w:type="gramEnd"/>
+            <w:r>
+              <w:rPr>
+                <w:rFonts w:ascii="Mulish" w:hAnsi="Mulish"/>
+                <w:b/>
+                <w:bCs/>
+                <w:lang w:val="es-AR"/>
+              </w:rPr>
+              <w:t>{</w:t>
+            </w:r>
+            <w:proofErr w:type="spellStart"/>
+            <w:r>
+              <w:rPr>
+                <w:rFonts w:ascii="Mulish" w:hAnsi="Mulish"/>
+                <w:b/>
+                <w:bCs/>
+                <w:lang w:val="es-AR"/>
+              </w:rPr>
+              <w:t>horas_trabajadas</w:t>
+            </w:r>
+            <w:proofErr w:type="spellEnd"/>
+            <w:r>
+              <w:rPr>
+                <w:rFonts w:ascii="Mulish" w:hAnsi="Mulish"/>
+                <w:b/>
+                <w:bCs/>
+                <w:lang w:val="es-AR"/>
+              </w:rPr>
+              <w:t>}}</w:t>
             </w:r>
           </w:p>
         </w:tc>
@@ -805,58 +917,7 @@
         <w:spacing w:after="0"/>
         <w:rPr>
           <w:rFonts w:ascii="Mulish" w:hAnsi="Mulish"/>
-          <w:lang w:val="en-US"/>
-        </w:rPr>
-      </w:pPr>
-    </w:p>
-    <w:p>
-      <w:pPr>
-        <w:rPr>
-          <w:rFonts w:ascii="Mulish" w:hAnsi="Mulish"/>
-          <w:lang w:val="en-US"/>
-        </w:rPr>
-      </w:pPr>
-      <w:r>
-        <w:rPr>
-          <w:rFonts w:ascii="Mulish" w:hAnsi="Mulish"/>
-          <w:lang w:val="en-US"/>
-        </w:rPr>
-        <w:br w:type="page"/>
-      </w:r>
-    </w:p>
-    <w:p>
-      <w:pPr>
-        <w:spacing w:before="240"/>
-        <w:rPr>
-          <w:rFonts w:ascii="Mulish" w:hAnsi="Mulish"/>
-          <w:b/>
-          <w:sz w:val="28"/>
-          <w:szCs w:val="28"/>
-        </w:rPr>
-      </w:pPr>
-      <w:r>
-        <w:rPr>
-          <w:rFonts w:ascii="Mulish" w:hAnsi="Mulish"/>
-          <w:b/>
-          <w:sz w:val="28"/>
-          <w:szCs w:val="28"/>
-        </w:rPr>
-        <w:lastRenderedPageBreak/>
-        <w:t>Progreso trimestral:</w:t>
-      </w:r>
-    </w:p>
-    <w:p>
-      <w:pPr>
-        <w:jc w:val="center"/>
-        <w:rPr>
-          <w:rFonts w:ascii="Mulish" w:hAnsi="Mulish"/>
-        </w:rPr>
-      </w:pPr>
-    </w:p>
-    <w:p>
-      <w:pPr>
-        <w:rPr>
-          <w:rFonts w:ascii="Mulish" w:hAnsi="Mulish"/>
+          <w:lang w:val="es-AR"/>
         </w:rPr>
       </w:pPr>
     </w:p>
@@ -867,11 +928,11 @@
         <w:tblLook w:val="04A0" w:firstRow="1" w:lastRow="0" w:firstColumn="1" w:lastColumn="0" w:noHBand="0" w:noVBand="1"/>
       </w:tblPr>
       <w:tblGrid>
-        <w:gridCol w:w="13994"/>
+        <w:gridCol w:w="10338"/>
       </w:tblGrid>
       <w:tr>
         <w:trPr>
-          <w:trHeight w:val="567"/>
+          <w:trHeight w:val="459"/>
         </w:trPr>
         <w:tc>
           <w:tcPr>
@@ -884,12 +945,21 @@
               <w:jc w:val="center"/>
               <w:rPr>
                 <w:rFonts w:ascii="Mulish" w:hAnsi="Mulish"/>
+                <w:lang w:val="es-AR"/>
               </w:rPr>
             </w:pPr>
             <w:r>
               <w:rPr>
                 <w:rFonts w:ascii="Mulish" w:hAnsi="Mulish"/>
+                <w:lang w:val="es-AR"/>
+              </w:rPr>
+              <w:br w:type="page"/>
+            </w:r>
+            <w:r>
+              <w:rPr>
+                <w:rFonts w:ascii="Mulish" w:hAnsi="Mulish"/>
                 <w:b/>
+                <w:lang w:val="es-AR"/>
               </w:rPr>
               <w:t>COMENTARIOS</w:t>
             </w:r>
@@ -898,7 +968,7 @@
       </w:tr>
       <w:tr>
         <w:trPr>
-          <w:trHeight w:val="1701"/>
+          <w:trHeight w:val="1378"/>
         </w:trPr>
         <w:tc>
           <w:tcPr>
@@ -910,14 +980,117 @@
               <w:spacing w:before="240"/>
               <w:rPr>
                 <w:rFonts w:ascii="Mulish" w:hAnsi="Mulish"/>
+                <w:lang w:val="es-AR"/>
               </w:rPr>
             </w:pPr>
+            <w:r>
+              <w:rPr>
+                <w:rFonts w:ascii="Mulish" w:hAnsi="Mulish"/>
+                <w:lang w:val="es-AR"/>
+              </w:rPr>
+              <w:t>El agente {{</w:t>
+            </w:r>
+            <w:proofErr w:type="spellStart"/>
+            <w:r>
+              <w:rPr>
+                <w:rFonts w:ascii="Mulish" w:hAnsi="Mulish"/>
+                <w:lang w:val="es-AR"/>
+              </w:rPr>
+              <w:t>nombre_empleado</w:t>
+            </w:r>
+            <w:proofErr w:type="spellEnd"/>
+            <w:r>
+              <w:rPr>
+                <w:rFonts w:ascii="Mulish" w:hAnsi="Mulish"/>
+                <w:lang w:val="es-AR"/>
+              </w:rPr>
+              <w:t>}} durante el mes de {{periodo}} trabajó en total {{</w:t>
+            </w:r>
+            <w:proofErr w:type="spellStart"/>
+            <w:r>
+              <w:rPr>
+                <w:rFonts w:ascii="Mulish" w:hAnsi="Mulish"/>
+                <w:lang w:val="es-AR"/>
+              </w:rPr>
+              <w:t>horas_trabajadas</w:t>
+            </w:r>
+            <w:proofErr w:type="spellEnd"/>
+            <w:r>
+              <w:rPr>
+                <w:rFonts w:ascii="Mulish" w:hAnsi="Mulish"/>
+                <w:lang w:val="es-AR"/>
+              </w:rPr>
+              <w:t>}} siendo el total de horas mínimas a cumplir de {{</w:t>
+            </w:r>
+            <w:proofErr w:type="spellStart"/>
+            <w:r>
+              <w:rPr>
+                <w:rFonts w:ascii="Mulish" w:hAnsi="Mulish"/>
+                <w:lang w:val="es-AR"/>
+              </w:rPr>
+              <w:t>horas_minimas</w:t>
+            </w:r>
+            <w:proofErr w:type="spellEnd"/>
+            <w:r>
+              <w:rPr>
+                <w:rFonts w:ascii="Mulish" w:hAnsi="Mulish"/>
+                <w:lang w:val="es-AR"/>
+              </w:rPr>
+              <w:t>}}</w:t>
+            </w:r>
+            <w:r>
+              <w:rPr>
+                <w:rFonts w:ascii="Mulish" w:hAnsi="Mulish"/>
+                <w:lang w:val="es-AR"/>
+              </w:rPr>
+              <w:t xml:space="preserve"> </w:t>
+            </w:r>
+            <w:r>
+              <w:rPr>
+                <w:rFonts w:ascii="Mulish" w:hAnsi="Mulish"/>
+                <w:lang w:val="es-AR"/>
+              </w:rPr>
+              <w:t xml:space="preserve">y </w:t>
+            </w:r>
+            <w:r>
+              <w:rPr>
+                <w:rFonts w:ascii="Mulish" w:hAnsi="Mulish"/>
+                <w:lang w:val="es-AR"/>
+              </w:rPr>
+              <w:t>la diferencia es de {{diferencia}}</w:t>
+            </w:r>
+          </w:p>
+          <w:p>
+            <w:pPr>
+              <w:spacing w:before="240"/>
+              <w:rPr>
+                <w:rFonts w:ascii="Mulish" w:hAnsi="Mulish"/>
+                <w:lang w:val="es-AR"/>
+              </w:rPr>
+            </w:pPr>
+            <w:r>
+              <w:rPr>
+                <w:rFonts w:ascii="Mulish" w:hAnsi="Mulish"/>
+                <w:lang w:val="es-AR"/>
+              </w:rPr>
+              <w:t xml:space="preserve">En caso de tener alguna observación para realizar, le pedimos que lo haga por correo electrónico a </w:t>
+            </w:r>
+            <w:hyperlink r:id="rId6" w:history="1">
+              <w:r>
+                <w:rPr>
+                  <w:rStyle w:val="Hipervnculo"/>
+                  <w:rFonts w:ascii="Mulish" w:hAnsi="Mulish"/>
+                  <w:lang w:val="es-AR"/>
+                </w:rPr>
+                <w:t>reportes@automatizacion_con_python.com</w:t>
+              </w:r>
+            </w:hyperlink>
           </w:p>
         </w:tc>
       </w:tr>
       <w:tr>
         <w:trPr>
-          <w:trHeight w:val="611"/>
+          <w:trHeight w:val="495"/>
         </w:trPr>
         <w:tc>
           <w:tcPr>
@@ -928,6 +1101,7 @@
             <w:pPr>
               <w:rPr>
                 <w:rFonts w:ascii="Mulish" w:hAnsi="Mulish"/>
+                <w:lang w:val="es-AR"/>
               </w:rPr>
             </w:pPr>
           </w:p>
@@ -943,14 +1117,9 @@
       </w:pPr>
     </w:p>
     <w:sectPr>
-      <w:headerReference w:type="even" r:id="rId6"/>
       <w:headerReference w:type="default" r:id="rId7"/>
-      <w:footerReference w:type="even" r:id="rId8"/>
-      <w:footerReference w:type="default" r:id="rId9"/>
-      <w:headerReference w:type="first" r:id="rId10"/>
-      <w:footerReference w:type="first" r:id="rId11"/>
-      <w:pgSz w:w="16838" w:h="11906" w:orient="landscape"/>
-      <w:pgMar w:top="1367" w:right="1417" w:bottom="709" w:left="1417" w:header="708" w:footer="708" w:gutter="0"/>
+      <w:pgSz w:w="11906" w:h="16838"/>
+      <w:pgMar w:top="1417" w:right="849" w:bottom="1417" w:left="709" w:header="708" w:footer="708" w:gutter="0"/>
       <w:cols w:space="708"/>
       <w:docGrid w:linePitch="360"/>
     </w:sectPr>
@@ -983,36 +1152,6 @@
 </w:endnotes>
 </file>
 
-<file path=word/footer1.xml><?xml version="1.0" encoding="utf-8"?>
-<w:ftr xmlns:wpc="http://schemas.microsoft.com/office/word/2010/wordprocessingCanvas" xmlns:cx="http://schemas.microsoft.com/office/drawing/2014/chartex" xmlns:cx1="http://schemas.microsoft.com/office/drawing/2015/9/8/chartex" xmlns:cx2="http://schemas.microsoft.com/office/drawing/2015/10/21/chartex" xmlns:cx3="http://schemas.microsoft.com/office/drawing/2016/5/9/chartex" xmlns:cx4="http://schemas.microsoft.com/office/drawing/2016/5/10/chartex" xmlns:cx5="http://schemas.microsoft.com/office/drawing/2016/5/11/chartex" xmlns:cx6="http://schemas.microsoft.com/office/drawing/2016/5/12/chartex" xmlns:cx7="http://schemas.microsoft.com/office/drawing/2016/5/13/chartex" xmlns:cx8="http://schemas.microsoft.com/office/drawing/2016/5/14/chartex" xmlns:mc="http://schemas.openxmlformats.org/markup-compatibility/2006" xmlns:aink="http://schemas.microsoft.com/office/drawing/2016/ink" xmlns:am3d="http://schemas.microsoft.com/office/drawing/2017/model3d" xmlns:o="urn:schemas-microsoft-com:office:office" xmlns:oel="http://schemas.microsoft.com/office/2019/extlst" xmlns:r="http://schemas.openxmlformats.org/officeDocument/2006/relationships" xmlns:m="http://schemas.openxmlformats.org/officeDocument/2006/math" xmlns:v="urn:schemas-microsoft-com:vml" xmlns:wp14="http://schemas.microsoft.com/office/word/2010/wordprocessingDrawing" xmlns:wp="http://schemas.openxmlformats.org/drawingml/2006/wordprocessingDrawing" xmlns:w10="urn:schemas-microsoft-com:office:word" xmlns:w="http://schemas.openxmlformats.org/wordprocessingml/2006/main" xmlns:w14="http://schemas.microsoft.com/office/word/2010/wordml" xmlns:w15="http://schemas.microsoft.com/office/word/2012/wordml" xmlns:w16cex="http://schemas.microsoft.com/office/word/2018/wordml/cex" xmlns:w16cid="http://schemas.microsoft.com/office/word/2016/wordml/cid" xmlns:w16="http://schemas.microsoft.com/office/word/2018/wordml" xmlns:w16du="http://schemas.microsoft.com/office/word/2023/wordml/word16du" xmlns:w16sdtdh="http://schemas.microsoft.com/office/word/2020/wordml/sdtdatahash" xmlns:w16sdtfl="http://schemas.microsoft.com/office/word/2024/wordml/sdtformatlock" xmlns:w16se="http://schemas.microsoft.com/office/word/2015/wordml/symex" xmlns:wpg="http://schemas.microsoft.com/office/word/2010/wordprocessingGroup" xmlns:wpi="http://schemas.microsoft.com/office/word/2010/wordprocessingInk" xmlns:wne="http://schemas.microsoft.com/office/word/2006/wordml" xmlns:wps="http://schemas.microsoft.com/office/word/2010/wordprocessingShape" mc:Ignorable="w14 w15 w16se w16cid w16 w16cex w16sdtdh w16sdtfl w16du wp14">
-  <w:p>
-    <w:pPr>
-      <w:pStyle w:val="Piedepgina"/>
-    </w:pPr>
-  </w:p>
-</w:ftr>
-</file>
-
-<file path=word/footer2.xml><?xml version="1.0" encoding="utf-8"?>
-<w:ftr xmlns:wpc="http://schemas.microsoft.com/office/word/2010/wordprocessingCanvas" xmlns:cx="http://schemas.microsoft.com/office/drawing/2014/chartex" xmlns:cx1="http://schemas.microsoft.com/office/drawing/2015/9/8/chartex" xmlns:cx2="http://schemas.microsoft.com/office/drawing/2015/10/21/chartex" xmlns:cx3="http://schemas.microsoft.com/office/drawing/2016/5/9/chartex" xmlns:cx4="http://schemas.microsoft.com/office/drawing/2016/5/10/chartex" xmlns:cx5="http://schemas.microsoft.com/office/drawing/2016/5/11/chartex" xmlns:cx6="http://schemas.microsoft.com/office/drawing/2016/5/12/chartex" xmlns:cx7="http://schemas.microsoft.com/office/drawing/2016/5/13/chartex" xmlns:cx8="http://schemas.microsoft.com/office/drawing/2016/5/14/chartex" xmlns:mc="http://schemas.openxmlformats.org/markup-compatibility/2006" xmlns:aink="http://schemas.microsoft.com/office/drawing/2016/ink" xmlns:am3d="http://schemas.microsoft.com/office/drawing/2017/model3d" xmlns:o="urn:schemas-microsoft-com:office:office" xmlns:oel="http://schemas.microsoft.com/office/2019/extlst" xmlns:r="http://schemas.openxmlformats.org/officeDocument/2006/relationships" xmlns:m="http://schemas.openxmlformats.org/officeDocument/2006/math" xmlns:v="urn:schemas-microsoft-com:vml" xmlns:wp14="http://schemas.microsoft.com/office/word/2010/wordprocessingDrawing" xmlns:wp="http://schemas.openxmlformats.org/drawingml/2006/wordprocessingDrawing" xmlns:w10="urn:schemas-microsoft-com:office:word" xmlns:w="http://schemas.openxmlformats.org/wordprocessingml/2006/main" xmlns:w14="http://schemas.microsoft.com/office/word/2010/wordml" xmlns:w15="http://schemas.microsoft.com/office/word/2012/wordml" xmlns:w16cex="http://schemas.microsoft.com/office/word/2018/wordml/cex" xmlns:w16cid="http://schemas.microsoft.com/office/word/2016/wordml/cid" xmlns:w16="http://schemas.microsoft.com/office/word/2018/wordml" xmlns:w16du="http://schemas.microsoft.com/office/word/2023/wordml/word16du" xmlns:w16sdtdh="http://schemas.microsoft.com/office/word/2020/wordml/sdtdatahash" xmlns:w16sdtfl="http://schemas.microsoft.com/office/word/2024/wordml/sdtformatlock" xmlns:w16se="http://schemas.microsoft.com/office/word/2015/wordml/symex" xmlns:wpg="http://schemas.microsoft.com/office/word/2010/wordprocessingGroup" xmlns:wpi="http://schemas.microsoft.com/office/word/2010/wordprocessingInk" xmlns:wne="http://schemas.microsoft.com/office/word/2006/wordml" xmlns:wps="http://schemas.microsoft.com/office/word/2010/wordprocessingShape" mc:Ignorable="w14 w15 w16se w16cid w16 w16cex w16sdtdh w16sdtfl w16du wp14">
-  <w:p>
-    <w:pPr>
-      <w:pStyle w:val="Piedepgina"/>
-    </w:pPr>
-  </w:p>
-</w:ftr>
-</file>
-
-<file path=word/footer3.xml><?xml version="1.0" encoding="utf-8"?>
-<w:ftr xmlns:wpc="http://schemas.microsoft.com/office/word/2010/wordprocessingCanvas" xmlns:cx="http://schemas.microsoft.com/office/drawing/2014/chartex" xmlns:cx1="http://schemas.microsoft.com/office/drawing/2015/9/8/chartex" xmlns:cx2="http://schemas.microsoft.com/office/drawing/2015/10/21/chartex" xmlns:cx3="http://schemas.microsoft.com/office/drawing/2016/5/9/chartex" xmlns:cx4="http://schemas.microsoft.com/office/drawing/2016/5/10/chartex" xmlns:cx5="http://schemas.microsoft.com/office/drawing/2016/5/11/chartex" xmlns:cx6="http://schemas.microsoft.com/office/drawing/2016/5/12/chartex" xmlns:cx7="http://schemas.microsoft.com/office/drawing/2016/5/13/chartex" xmlns:cx8="http://schemas.microsoft.com/office/drawing/2016/5/14/chartex" xmlns:mc="http://schemas.openxmlformats.org/markup-compatibility/2006" xmlns:aink="http://schemas.microsoft.com/office/drawing/2016/ink" xmlns:am3d="http://schemas.microsoft.com/office/drawing/2017/model3d" xmlns:o="urn:schemas-microsoft-com:office:office" xmlns:oel="http://schemas.microsoft.com/office/2019/extlst" xmlns:r="http://schemas.openxmlformats.org/officeDocument/2006/relationships" xmlns:m="http://schemas.openxmlformats.org/officeDocument/2006/math" xmlns:v="urn:schemas-microsoft-com:vml" xmlns:wp14="http://schemas.microsoft.com/office/word/2010/wordprocessingDrawing" xmlns:wp="http://schemas.openxmlformats.org/drawingml/2006/wordprocessingDrawing" xmlns:w10="urn:schemas-microsoft-com:office:word" xmlns:w="http://schemas.openxmlformats.org/wordprocessingml/2006/main" xmlns:w14="http://schemas.microsoft.com/office/word/2010/wordml" xmlns:w15="http://schemas.microsoft.com/office/word/2012/wordml" xmlns:w16cex="http://schemas.microsoft.com/office/word/2018/wordml/cex" xmlns:w16cid="http://schemas.microsoft.com/office/word/2016/wordml/cid" xmlns:w16="http://schemas.microsoft.com/office/word/2018/wordml" xmlns:w16du="http://schemas.microsoft.com/office/word/2023/wordml/word16du" xmlns:w16sdtdh="http://schemas.microsoft.com/office/word/2020/wordml/sdtdatahash" xmlns:w16sdtfl="http://schemas.microsoft.com/office/word/2024/wordml/sdtformatlock" xmlns:w16se="http://schemas.microsoft.com/office/word/2015/wordml/symex" xmlns:wpg="http://schemas.microsoft.com/office/word/2010/wordprocessingGroup" xmlns:wpi="http://schemas.microsoft.com/office/word/2010/wordprocessingInk" xmlns:wne="http://schemas.microsoft.com/office/word/2006/wordml" xmlns:wps="http://schemas.microsoft.com/office/word/2010/wordprocessingShape" mc:Ignorable="w14 w15 w16se w16cid w16 w16cex w16sdtdh w16sdtfl w16du wp14">
-  <w:p>
-    <w:pPr>
-      <w:pStyle w:val="Piedepgina"/>
-    </w:pPr>
-  </w:p>
-</w:ftr>
-</file>
-
 <file path=word/footnotes.xml><?xml version="1.0" encoding="utf-8"?>
 <w:footnotes xmlns:wpc="http://schemas.microsoft.com/office/word/2010/wordprocessingCanvas" xmlns:cx="http://schemas.microsoft.com/office/drawing/2014/chartex" xmlns:cx1="http://schemas.microsoft.com/office/drawing/2015/9/8/chartex" xmlns:cx2="http://schemas.microsoft.com/office/drawing/2015/10/21/chartex" xmlns:cx3="http://schemas.microsoft.com/office/drawing/2016/5/9/chartex" xmlns:cx4="http://schemas.microsoft.com/office/drawing/2016/5/10/chartex" xmlns:cx5="http://schemas.microsoft.com/office/drawing/2016/5/11/chartex" xmlns:cx6="http://schemas.microsoft.com/office/drawing/2016/5/12/chartex" xmlns:cx7="http://schemas.microsoft.com/office/drawing/2016/5/13/chartex" xmlns:cx8="http://schemas.microsoft.com/office/drawing/2016/5/14/chartex" xmlns:mc="http://schemas.openxmlformats.org/markup-compatibility/2006" xmlns:aink="http://schemas.microsoft.com/office/drawing/2016/ink" xmlns:am3d="http://schemas.microsoft.com/office/drawing/2017/model3d" xmlns:o="urn:schemas-microsoft-com:office:office" xmlns:oel="http://schemas.microsoft.com/office/2019/extlst" xmlns:r="http://schemas.openxmlformats.org/officeDocument/2006/relationships" xmlns:m="http://schemas.openxmlformats.org/officeDocument/2006/math" xmlns:v="urn:schemas-microsoft-com:vml" xmlns:wp14="http://schemas.microsoft.com/office/word/2010/wordprocessingDrawing" xmlns:wp="http://schemas.openxmlformats.org/drawingml/2006/wordprocessingDrawing" xmlns:w10="urn:schemas-microsoft-com:office:word" xmlns:w="http://schemas.openxmlformats.org/wordprocessingml/2006/main" xmlns:w14="http://schemas.microsoft.com/office/word/2010/wordml" xmlns:w15="http://schemas.microsoft.com/office/word/2012/wordml" xmlns:w16cex="http://schemas.microsoft.com/office/word/2018/wordml/cex" xmlns:w16cid="http://schemas.microsoft.com/office/word/2016/wordml/cid" xmlns:w16="http://schemas.microsoft.com/office/word/2018/wordml" xmlns:w16du="http://schemas.microsoft.com/office/word/2023/wordml/word16du" xmlns:w16sdtdh="http://schemas.microsoft.com/office/word/2020/wordml/sdtdatahash" xmlns:w16sdtfl="http://schemas.microsoft.com/office/word/2024/wordml/sdtformatlock" xmlns:w16se="http://schemas.microsoft.com/office/word/2015/wordml/symex" xmlns:wpg="http://schemas.microsoft.com/office/word/2010/wordprocessingGroup" xmlns:wpi="http://schemas.microsoft.com/office/word/2010/wordprocessingInk" xmlns:wne="http://schemas.microsoft.com/office/word/2006/wordml" xmlns:wps="http://schemas.microsoft.com/office/word/2010/wordprocessingShape" mc:Ignorable="w14 w15 w16se w16cid w16 w16cex w16sdtdh w16sdtfl w16du wp14">
   <w:footnote w:type="separator" w:id="-1">
@@ -1039,16 +1178,6 @@
 </file>
 
 <file path=word/header1.xml><?xml version="1.0" encoding="utf-8"?>
-<w:hdr xmlns:wpc="http://schemas.microsoft.com/office/word/2010/wordprocessingCanvas" xmlns:cx="http://schemas.microsoft.com/office/drawing/2014/chartex" xmlns:cx1="http://schemas.microsoft.com/office/drawing/2015/9/8/chartex" xmlns:cx2="http://schemas.microsoft.com/office/drawing/2015/10/21/chartex" xmlns:cx3="http://schemas.microsoft.com/office/drawing/2016/5/9/chartex" xmlns:cx4="http://schemas.microsoft.com/office/drawing/2016/5/10/chartex" xmlns:cx5="http://schemas.microsoft.com/office/drawing/2016/5/11/chartex" xmlns:cx6="http://schemas.microsoft.com/office/drawing/2016/5/12/chartex" xmlns:cx7="http://schemas.microsoft.com/office/drawing/2016/5/13/chartex" xmlns:cx8="http://schemas.microsoft.com/office/drawing/2016/5/14/chartex" xmlns:mc="http://schemas.openxmlformats.org/markup-compatibility/2006" xmlns:aink="http://schemas.microsoft.com/office/drawing/2016/ink" xmlns:am3d="http://schemas.microsoft.com/office/drawing/2017/model3d" xmlns:o="urn:schemas-microsoft-com:office:office" xmlns:oel="http://schemas.microsoft.com/office/2019/extlst" xmlns:r="http://schemas.openxmlformats.org/officeDocument/2006/relationships" xmlns:m="http://schemas.openxmlformats.org/officeDocument/2006/math" xmlns:v="urn:schemas-microsoft-com:vml" xmlns:wp14="http://schemas.microsoft.com/office/word/2010/wordprocessingDrawing" xmlns:wp="http://schemas.openxmlformats.org/drawingml/2006/wordprocessingDrawing" xmlns:w10="urn:schemas-microsoft-com:office:word" xmlns:w="http://schemas.openxmlformats.org/wordprocessingml/2006/main" xmlns:w14="http://schemas.microsoft.com/office/word/2010/wordml" xmlns:w15="http://schemas.microsoft.com/office/word/2012/wordml" xmlns:w16cex="http://schemas.microsoft.com/office/word/2018/wordml/cex" xmlns:w16cid="http://schemas.microsoft.com/office/word/2016/wordml/cid" xmlns:w16="http://schemas.microsoft.com/office/word/2018/wordml" xmlns:w16du="http://schemas.microsoft.com/office/word/2023/wordml/word16du" xmlns:w16sdtdh="http://schemas.microsoft.com/office/word/2020/wordml/sdtdatahash" xmlns:w16sdtfl="http://schemas.microsoft.com/office/word/2024/wordml/sdtformatlock" xmlns:w16se="http://schemas.microsoft.com/office/word/2015/wordml/symex" xmlns:wpg="http://schemas.microsoft.com/office/word/2010/wordprocessingGroup" xmlns:wpi="http://schemas.microsoft.com/office/word/2010/wordprocessingInk" xmlns:wne="http://schemas.microsoft.com/office/word/2006/wordml" xmlns:wps="http://schemas.microsoft.com/office/word/2010/wordprocessingShape" mc:Ignorable="w14 w15 w16se w16cid w16 w16cex w16sdtdh w16sdtfl w16du wp14">
-  <w:p>
-    <w:pPr>
-      <w:pStyle w:val="Encabezado"/>
-    </w:pPr>
-  </w:p>
-</w:hdr>
-</file>
-
-<file path=word/header2.xml><?xml version="1.0" encoding="utf-8"?>
 <w:hdr xmlns:wpc="http://schemas.microsoft.com/office/word/2010/wordprocessingCanvas" xmlns:cx="http://schemas.microsoft.com/office/drawing/2014/chartex" xmlns:cx1="http://schemas.microsoft.com/office/drawing/2015/9/8/chartex" xmlns:cx2="http://schemas.microsoft.com/office/drawing/2015/10/21/chartex" xmlns:cx3="http://schemas.microsoft.com/office/drawing/2016/5/9/chartex" xmlns:cx4="http://schemas.microsoft.com/office/drawing/2016/5/10/chartex" xmlns:cx5="http://schemas.microsoft.com/office/drawing/2016/5/11/chartex" xmlns:cx6="http://schemas.microsoft.com/office/drawing/2016/5/12/chartex" xmlns:cx7="http://schemas.microsoft.com/office/drawing/2016/5/13/chartex" xmlns:cx8="http://schemas.microsoft.com/office/drawing/2016/5/14/chartex" xmlns:mc="http://schemas.openxmlformats.org/markup-compatibility/2006" xmlns:aink="http://schemas.microsoft.com/office/drawing/2016/ink" xmlns:am3d="http://schemas.microsoft.com/office/drawing/2017/model3d" xmlns:o="urn:schemas-microsoft-com:office:office" xmlns:oel="http://schemas.microsoft.com/office/2019/extlst" xmlns:r="http://schemas.openxmlformats.org/officeDocument/2006/relationships" xmlns:m="http://schemas.openxmlformats.org/officeDocument/2006/math" xmlns:v="urn:schemas-microsoft-com:vml" xmlns:wp14="http://schemas.microsoft.com/office/word/2010/wordprocessingDrawing" xmlns:wp="http://schemas.openxmlformats.org/drawingml/2006/wordprocessingDrawing" xmlns:w10="urn:schemas-microsoft-com:office:word" xmlns:w="http://schemas.openxmlformats.org/wordprocessingml/2006/main" xmlns:w14="http://schemas.microsoft.com/office/word/2010/wordml" xmlns:w15="http://schemas.microsoft.com/office/word/2012/wordml" xmlns:w16cex="http://schemas.microsoft.com/office/word/2018/wordml/cex" xmlns:w16cid="http://schemas.microsoft.com/office/word/2016/wordml/cid" xmlns:w16="http://schemas.microsoft.com/office/word/2018/wordml" xmlns:w16du="http://schemas.microsoft.com/office/word/2023/wordml/word16du" xmlns:w16sdtdh="http://schemas.microsoft.com/office/word/2020/wordml/sdtdatahash" xmlns:w16sdtfl="http://schemas.microsoft.com/office/word/2024/wordml/sdtformatlock" xmlns:w16se="http://schemas.microsoft.com/office/word/2015/wordml/symex" xmlns:wpg="http://schemas.microsoft.com/office/word/2010/wordprocessingGroup" xmlns:wpi="http://schemas.microsoft.com/office/word/2010/wordprocessingInk" xmlns:wne="http://schemas.microsoft.com/office/word/2006/wordml" xmlns:wps="http://schemas.microsoft.com/office/word/2010/wordprocessingShape" mc:Ignorable="w14 w15 w16se w16cid w16 w16cex w16sdtdh w16sdtfl w16du wp14">
   <w:tbl>
     <w:tblPr>
@@ -1065,9 +1194,9 @@
       <w:tblLook w:val="04A0" w:firstRow="1" w:lastRow="0" w:firstColumn="1" w:lastColumn="0" w:noHBand="0" w:noVBand="1"/>
     </w:tblPr>
     <w:tblGrid>
-      <w:gridCol w:w="846"/>
-      <w:gridCol w:w="8570"/>
-      <w:gridCol w:w="4578"/>
+      <w:gridCol w:w="631"/>
+      <w:gridCol w:w="6351"/>
+      <w:gridCol w:w="3366"/>
     </w:tblGrid>
     <w:tr>
       <w:trPr>
@@ -1108,7 +1237,7 @@
                 <wp:extent cx="507365" cy="507365"/>
                 <wp:effectExtent l="0" t="0" r="6985" b="6985"/>
                 <wp:wrapNone/>
-                <wp:docPr id="1275979250" name="Imagen 1" descr="Logotipo, nombre de la empresa&#10;&#10;El contenido generado por IA puede ser incorrecto."/>
+                <wp:docPr id="732567302" name="Imagen 1" descr="Logotipo, nombre de la empresa&#10;&#10;El contenido generado por IA puede ser incorrecto."/>
                 <wp:cNvGraphicFramePr>
                   <a:graphicFrameLocks xmlns:a="http://schemas.openxmlformats.org/drawingml/2006/main" noChangeAspect="1"/>
                 </wp:cNvGraphicFramePr>
@@ -1210,13 +1339,19 @@
             <w:rPr>
               <w:rFonts w:ascii="Mulish" w:hAnsi="Mulish"/>
             </w:rPr>
-            <w:t xml:space="preserve">Paraná, Entre Ríos, </w:t>
+            <w:t>Oro Verde</w:t>
           </w:r>
           <w:r>
             <w:rPr>
               <w:rFonts w:ascii="Mulish" w:hAnsi="Mulish"/>
             </w:rPr>
-            <w:t xml:space="preserve">{{ </w:t>
+            <w:t xml:space="preserve">, Entre Ríos, </w:t>
+          </w:r>
+          <w:r>
+            <w:rPr>
+              <w:rFonts w:ascii="Mulish" w:hAnsi="Mulish"/>
+            </w:rPr>
+            <w:t>{{</w:t>
           </w:r>
           <w:r>
             <w:rPr>
@@ -1228,7 +1363,7 @@
             <w:rPr>
               <w:rFonts w:ascii="Mulish" w:hAnsi="Mulish"/>
             </w:rPr>
-            <w:t xml:space="preserve"> }}</w:t>
+            <w:t>}}</w:t>
           </w:r>
         </w:p>
       </w:tc>
@@ -1240,16 +1375,6 @@
       <w:rPr>
         <w:rFonts w:ascii="Mulish" w:hAnsi="Mulish"/>
       </w:rPr>
-    </w:pPr>
-  </w:p>
-</w:hdr>
-</file>
-
-<file path=word/header3.xml><?xml version="1.0" encoding="utf-8"?>
-<w:hdr xmlns:wpc="http://schemas.microsoft.com/office/word/2010/wordprocessingCanvas" xmlns:cx="http://schemas.microsoft.com/office/drawing/2014/chartex" xmlns:cx1="http://schemas.microsoft.com/office/drawing/2015/9/8/chartex" xmlns:cx2="http://schemas.microsoft.com/office/drawing/2015/10/21/chartex" xmlns:cx3="http://schemas.microsoft.com/office/drawing/2016/5/9/chartex" xmlns:cx4="http://schemas.microsoft.com/office/drawing/2016/5/10/chartex" xmlns:cx5="http://schemas.microsoft.com/office/drawing/2016/5/11/chartex" xmlns:cx6="http://schemas.microsoft.com/office/drawing/2016/5/12/chartex" xmlns:cx7="http://schemas.microsoft.com/office/drawing/2016/5/13/chartex" xmlns:cx8="http://schemas.microsoft.com/office/drawing/2016/5/14/chartex" xmlns:mc="http://schemas.openxmlformats.org/markup-compatibility/2006" xmlns:aink="http://schemas.microsoft.com/office/drawing/2016/ink" xmlns:am3d="http://schemas.microsoft.com/office/drawing/2017/model3d" xmlns:o="urn:schemas-microsoft-com:office:office" xmlns:oel="http://schemas.microsoft.com/office/2019/extlst" xmlns:r="http://schemas.openxmlformats.org/officeDocument/2006/relationships" xmlns:m="http://schemas.openxmlformats.org/officeDocument/2006/math" xmlns:v="urn:schemas-microsoft-com:vml" xmlns:wp14="http://schemas.microsoft.com/office/word/2010/wordprocessingDrawing" xmlns:wp="http://schemas.openxmlformats.org/drawingml/2006/wordprocessingDrawing" xmlns:w10="urn:schemas-microsoft-com:office:word" xmlns:w="http://schemas.openxmlformats.org/wordprocessingml/2006/main" xmlns:w14="http://schemas.microsoft.com/office/word/2010/wordml" xmlns:w15="http://schemas.microsoft.com/office/word/2012/wordml" xmlns:w16cex="http://schemas.microsoft.com/office/word/2018/wordml/cex" xmlns:w16cid="http://schemas.microsoft.com/office/word/2016/wordml/cid" xmlns:w16="http://schemas.microsoft.com/office/word/2018/wordml" xmlns:w16du="http://schemas.microsoft.com/office/word/2023/wordml/word16du" xmlns:w16sdtdh="http://schemas.microsoft.com/office/word/2020/wordml/sdtdatahash" xmlns:w16sdtfl="http://schemas.microsoft.com/office/word/2024/wordml/sdtformatlock" xmlns:w16se="http://schemas.microsoft.com/office/word/2015/wordml/symex" xmlns:wpg="http://schemas.microsoft.com/office/word/2010/wordprocessingGroup" xmlns:wpi="http://schemas.microsoft.com/office/word/2010/wordprocessingInk" xmlns:wne="http://schemas.microsoft.com/office/word/2006/wordml" xmlns:wps="http://schemas.microsoft.com/office/word/2010/wordprocessingShape" mc:Ignorable="w14 w15 w16se w16cid w16 w16cex w16sdtdh w16sdtfl w16du wp14">
-  <w:p>
-    <w:pPr>
-      <w:pStyle w:val="Encabezado"/>
     </w:pPr>
   </w:p>
 </w:hdr>
@@ -1761,6 +1886,29 @@
       <w:lang w:val="en-US" w:eastAsia="zh-CN" w:bidi="hi-IN"/>
     </w:rPr>
   </w:style>
+  <w:style w:type="character" w:styleId="Hipervnculo">
+    <w:name w:val="Hyperlink"/>
+    <w:basedOn w:val="Fuentedeprrafopredeter"/>
+    <w:uiPriority w:val="99"/>
+    <w:unhideWhenUsed/>
+    <w:rsid w:val="0028177A"/>
+    <w:rPr>
+      <w:color w:val="0563C1" w:themeColor="hyperlink"/>
+      <w:u w:val="single"/>
+    </w:rPr>
+  </w:style>
+  <w:style w:type="character" w:styleId="Mencinsinresolver">
+    <w:name w:val="Unresolved Mention"/>
+    <w:basedOn w:val="Fuentedeprrafopredeter"/>
+    <w:uiPriority w:val="99"/>
+    <w:semiHidden/>
+    <w:unhideWhenUsed/>
+    <w:rsid w:val="0028177A"/>
+    <w:rPr>
+      <w:color w:val="605E5C"/>
+      <w:shd w:val="clear" w:color="auto" w:fill="E1DFDD"/>
+    </w:rPr>
+  </w:style>
 </w:styles>
 </file>
 

</xml_diff>

<commit_message>
agregando graficos al informe del empleado
</commit_message>
<xml_diff>
--- a/inputs/plantilla_horas.docx
+++ b/inputs/plantilla_horas.docx
@@ -5,9 +5,10 @@
     <w:p>
       <w:pPr>
         <w:spacing w:after="360"/>
+        <w:ind w:left="1416" w:hanging="1416"/>
         <w:jc w:val="center"/>
         <w:rPr>
-          <w:rFonts w:ascii="Mulish" w:hAnsi="Mulish"/>
+          <w:rFonts w:cstheme="minorHAnsi"/>
           <w:b/>
           <w:sz w:val="40"/>
           <w:szCs w:val="40"/>
@@ -16,7 +17,7 @@
       </w:pPr>
       <w:r>
         <w:rPr>
-          <w:rFonts w:ascii="Mulish" w:hAnsi="Mulish"/>
+          <w:rFonts w:cstheme="minorHAnsi"/>
           <w:b/>
           <w:sz w:val="40"/>
           <w:szCs w:val="40"/>
@@ -26,7 +27,7 @@
       </w:r>
       <w:r>
         <w:rPr>
-          <w:rFonts w:ascii="Mulish" w:hAnsi="Mulish"/>
+          <w:rFonts w:cstheme="minorHAnsi"/>
           <w:b/>
           <w:sz w:val="40"/>
           <w:szCs w:val="40"/>
@@ -36,7 +37,7 @@
       </w:r>
       <w:r>
         <w:rPr>
-          <w:rFonts w:ascii="Mulish" w:hAnsi="Mulish"/>
+          <w:rFonts w:cstheme="minorHAnsi"/>
           <w:b/>
           <w:sz w:val="40"/>
           <w:szCs w:val="40"/>
@@ -46,7 +47,7 @@
       </w:r>
       <w:r>
         <w:rPr>
-          <w:rFonts w:ascii="Mulish" w:hAnsi="Mulish"/>
+          <w:rFonts w:cstheme="minorHAnsi"/>
           <w:b/>
           <w:sz w:val="40"/>
           <w:szCs w:val="40"/>
@@ -56,7 +57,7 @@
       </w:r>
       <w:r>
         <w:rPr>
-          <w:rFonts w:ascii="Mulish" w:hAnsi="Mulish"/>
+          <w:rFonts w:cstheme="minorHAnsi"/>
           <w:b/>
           <w:sz w:val="40"/>
           <w:szCs w:val="40"/>
@@ -66,7 +67,7 @@
       </w:r>
       <w:r>
         <w:rPr>
-          <w:rFonts w:ascii="Mulish" w:hAnsi="Mulish"/>
+          <w:rFonts w:cstheme="minorHAnsi"/>
           <w:b/>
           <w:sz w:val="40"/>
           <w:szCs w:val="40"/>
@@ -79,7 +80,7 @@
       <w:pPr>
         <w:spacing w:after="0"/>
         <w:rPr>
-          <w:rFonts w:ascii="Mulish" w:hAnsi="Mulish"/>
+          <w:rFonts w:cstheme="minorHAnsi"/>
           <w:sz w:val="28"/>
           <w:szCs w:val="28"/>
           <w:lang w:val="es-AR"/>
@@ -87,7 +88,7 @@
       </w:pPr>
       <w:r>
         <w:rPr>
-          <w:rFonts w:ascii="Mulish" w:hAnsi="Mulish"/>
+          <w:rFonts w:cstheme="minorHAnsi"/>
           <w:b/>
           <w:bCs/>
           <w:sz w:val="28"/>
@@ -98,7 +99,7 @@
       </w:r>
       <w:r>
         <w:rPr>
-          <w:rFonts w:ascii="Mulish" w:hAnsi="Mulish"/>
+          <w:rFonts w:cstheme="minorHAnsi"/>
           <w:sz w:val="28"/>
           <w:szCs w:val="28"/>
           <w:lang w:val="es-AR"/>
@@ -108,7 +109,7 @@
       <w:proofErr w:type="spellStart"/>
       <w:r>
         <w:rPr>
-          <w:rFonts w:ascii="Mulish" w:hAnsi="Mulish"/>
+          <w:rFonts w:cstheme="minorHAnsi"/>
           <w:sz w:val="28"/>
           <w:szCs w:val="28"/>
           <w:lang w:val="es-AR"/>
@@ -118,7 +119,7 @@
       <w:proofErr w:type="spellEnd"/>
       <w:r>
         <w:rPr>
-          <w:rFonts w:ascii="Mulish" w:hAnsi="Mulish"/>
+          <w:rFonts w:cstheme="minorHAnsi"/>
           <w:sz w:val="28"/>
           <w:szCs w:val="28"/>
           <w:lang w:val="es-AR"/>
@@ -130,140 +131,7 @@
       <w:pPr>
         <w:spacing w:after="0"/>
         <w:rPr>
-          <w:rFonts w:ascii="Mulish" w:hAnsi="Mulish"/>
-          <w:sz w:val="28"/>
-          <w:szCs w:val="28"/>
-          <w:lang w:val="es-AR"/>
-        </w:rPr>
-      </w:pPr>
-      <w:r>
-        <w:rPr>
-          <w:rFonts w:ascii="Mulish" w:hAnsi="Mulish"/>
-          <w:b/>
-          <w:bCs/>
-          <w:sz w:val="28"/>
-          <w:szCs w:val="28"/>
-          <w:lang w:val="es-AR"/>
-        </w:rPr>
-        <w:t>Horas Trabajadas:</w:t>
-      </w:r>
-      <w:r>
-        <w:rPr>
-          <w:rFonts w:ascii="Mulish" w:hAnsi="Mulish"/>
-          <w:sz w:val="28"/>
-          <w:szCs w:val="28"/>
-          <w:lang w:val="es-AR"/>
-        </w:rPr>
-        <w:t xml:space="preserve"> {{</w:t>
-      </w:r>
-      <w:proofErr w:type="spellStart"/>
-      <w:r>
-        <w:rPr>
-          <w:rFonts w:ascii="Mulish" w:hAnsi="Mulish"/>
-          <w:sz w:val="28"/>
-          <w:szCs w:val="28"/>
-          <w:lang w:val="es-AR"/>
-        </w:rPr>
-        <w:t>horas_trabajadas</w:t>
-      </w:r>
-      <w:proofErr w:type="spellEnd"/>
-      <w:r>
-        <w:rPr>
-          <w:rFonts w:ascii="Mulish" w:hAnsi="Mulish"/>
-          <w:sz w:val="28"/>
-          <w:szCs w:val="28"/>
-          <w:lang w:val="es-AR"/>
-        </w:rPr>
-        <w:t>}}</w:t>
-      </w:r>
-    </w:p>
-    <w:p>
-      <w:pPr>
-        <w:spacing w:after="0"/>
-        <w:rPr>
-          <w:rFonts w:ascii="Mulish" w:hAnsi="Mulish"/>
-          <w:sz w:val="28"/>
-          <w:szCs w:val="28"/>
-          <w:lang w:val="es-AR"/>
-        </w:rPr>
-      </w:pPr>
-      <w:r>
-        <w:rPr>
-          <w:rFonts w:ascii="Mulish" w:hAnsi="Mulish"/>
-          <w:b/>
-          <w:bCs/>
-          <w:sz w:val="28"/>
-          <w:szCs w:val="28"/>
-          <w:lang w:val="es-AR"/>
-        </w:rPr>
-        <w:t>Horas Mínimas por Trabajar:</w:t>
-      </w:r>
-      <w:r>
-        <w:rPr>
-          <w:rFonts w:ascii="Mulish" w:hAnsi="Mulish"/>
-          <w:sz w:val="28"/>
-          <w:szCs w:val="28"/>
-          <w:lang w:val="es-AR"/>
-        </w:rPr>
-        <w:t xml:space="preserve"> {{</w:t>
-      </w:r>
-      <w:proofErr w:type="spellStart"/>
-      <w:r>
-        <w:rPr>
-          <w:rFonts w:ascii="Mulish" w:hAnsi="Mulish"/>
-          <w:sz w:val="28"/>
-          <w:szCs w:val="28"/>
-          <w:lang w:val="es-AR"/>
-        </w:rPr>
-        <w:t>horas_minimas</w:t>
-      </w:r>
-      <w:proofErr w:type="spellEnd"/>
-      <w:r>
-        <w:rPr>
-          <w:rFonts w:ascii="Mulish" w:hAnsi="Mulish"/>
-          <w:sz w:val="28"/>
-          <w:szCs w:val="28"/>
-          <w:lang w:val="es-AR"/>
-        </w:rPr>
-        <w:t>}}</w:t>
-      </w:r>
-    </w:p>
-    <w:p>
-      <w:pPr>
-        <w:spacing w:after="0"/>
-        <w:rPr>
-          <w:rFonts w:ascii="Mulish" w:hAnsi="Mulish"/>
-          <w:sz w:val="28"/>
-          <w:szCs w:val="28"/>
-          <w:lang w:val="es-AR"/>
-        </w:rPr>
-      </w:pPr>
-      <w:r>
-        <w:rPr>
-          <w:rFonts w:ascii="Mulish" w:hAnsi="Mulish"/>
-          <w:b/>
-          <w:bCs/>
-          <w:sz w:val="28"/>
-          <w:szCs w:val="28"/>
-          <w:lang w:val="es-AR"/>
-        </w:rPr>
-        <w:t>Diferencia:</w:t>
-      </w:r>
-      <w:r>
-        <w:rPr>
-          <w:rFonts w:ascii="Mulish" w:hAnsi="Mulish"/>
-          <w:sz w:val="28"/>
-          <w:szCs w:val="28"/>
-          <w:lang w:val="es-AR"/>
-        </w:rPr>
-        <w:t xml:space="preserve"> {{diferencia}}</w:t>
-      </w:r>
-    </w:p>
-    <w:p>
-      <w:pPr>
-        <w:spacing w:after="0"/>
-        <w:rPr>
-          <w:rFonts w:ascii="Mulish" w:hAnsi="Mulish"/>
+          <w:rFonts w:cstheme="minorHAnsi"/>
           <w:lang w:val="es-AR"/>
         </w:rPr>
       </w:pPr>
@@ -276,11 +144,11 @@
         <w:tblLook w:val="04A0" w:firstRow="1" w:lastRow="0" w:firstColumn="1" w:lastColumn="0" w:noHBand="0" w:noVBand="1"/>
       </w:tblPr>
       <w:tblGrid>
-        <w:gridCol w:w="1579"/>
-        <w:gridCol w:w="1780"/>
-        <w:gridCol w:w="1595"/>
-        <w:gridCol w:w="2260"/>
-        <w:gridCol w:w="3126"/>
+        <w:gridCol w:w="1483"/>
+        <w:gridCol w:w="1658"/>
+        <w:gridCol w:w="1487"/>
+        <w:gridCol w:w="3806"/>
+        <w:gridCol w:w="1906"/>
       </w:tblGrid>
       <w:tr>
         <w:trPr>
@@ -296,14 +164,14 @@
             <w:pPr>
               <w:jc w:val="center"/>
               <w:rPr>
-                <w:rFonts w:ascii="Mulish" w:hAnsi="Mulish"/>
+                <w:rFonts w:cstheme="minorHAnsi"/>
                 <w:b/>
                 <w:lang w:val="es-AR"/>
               </w:rPr>
             </w:pPr>
             <w:r>
               <w:rPr>
-                <w:rFonts w:ascii="Mulish" w:hAnsi="Mulish"/>
+                <w:rFonts w:cstheme="minorHAnsi"/>
                 <w:b/>
                 <w:lang w:val="es-AR"/>
               </w:rPr>
@@ -321,14 +189,14 @@
             <w:pPr>
               <w:jc w:val="center"/>
               <w:rPr>
-                <w:rFonts w:ascii="Mulish" w:hAnsi="Mulish"/>
+                <w:rFonts w:cstheme="minorHAnsi"/>
                 <w:b/>
                 <w:lang w:val="es-AR"/>
               </w:rPr>
             </w:pPr>
             <w:r>
               <w:rPr>
-                <w:rFonts w:ascii="Mulish" w:hAnsi="Mulish"/>
+                <w:rFonts w:cstheme="minorHAnsi"/>
                 <w:b/>
                 <w:lang w:val="es-AR"/>
               </w:rPr>
@@ -346,14 +214,14 @@
             <w:pPr>
               <w:jc w:val="center"/>
               <w:rPr>
-                <w:rFonts w:ascii="Mulish" w:hAnsi="Mulish"/>
+                <w:rFonts w:cstheme="minorHAnsi"/>
                 <w:b/>
                 <w:lang w:val="es-AR"/>
               </w:rPr>
             </w:pPr>
             <w:r>
               <w:rPr>
-                <w:rFonts w:ascii="Mulish" w:hAnsi="Mulish"/>
+                <w:rFonts w:cstheme="minorHAnsi"/>
                 <w:b/>
                 <w:lang w:val="es-AR"/>
               </w:rPr>
@@ -371,14 +239,14 @@
             <w:pPr>
               <w:jc w:val="center"/>
               <w:rPr>
-                <w:rFonts w:ascii="Mulish" w:hAnsi="Mulish"/>
+                <w:rFonts w:cstheme="minorHAnsi"/>
                 <w:b/>
                 <w:lang w:val="es-AR"/>
               </w:rPr>
             </w:pPr>
             <w:r>
               <w:rPr>
-                <w:rFonts w:ascii="Mulish" w:hAnsi="Mulish"/>
+                <w:rFonts w:cstheme="minorHAnsi"/>
                 <w:b/>
                 <w:lang w:val="es-AR"/>
               </w:rPr>
@@ -396,14 +264,14 @@
             <w:pPr>
               <w:jc w:val="center"/>
               <w:rPr>
-                <w:rFonts w:ascii="Mulish" w:hAnsi="Mulish"/>
+                <w:rFonts w:cstheme="minorHAnsi"/>
                 <w:b/>
                 <w:lang w:val="es-AR"/>
               </w:rPr>
             </w:pPr>
             <w:r>
               <w:rPr>
-                <w:rFonts w:ascii="Mulish" w:hAnsi="Mulish"/>
+                <w:rFonts w:cstheme="minorHAnsi"/>
                 <w:b/>
                 <w:lang w:val="es-AR"/>
               </w:rPr>
@@ -425,14 +293,14 @@
           <w:p>
             <w:pPr>
               <w:rPr>
-                <w:rFonts w:ascii="Mulish" w:hAnsi="Mulish"/>
+                <w:rFonts w:cstheme="minorHAnsi"/>
                 <w:color w:val="000000" w:themeColor="text1"/>
                 <w:lang w:val="es-AR"/>
               </w:rPr>
             </w:pPr>
             <w:r>
               <w:rPr>
-                <w:rFonts w:ascii="Mulish" w:hAnsi="Mulish"/>
+                <w:rFonts w:cstheme="minorHAnsi"/>
                 <w:color w:val="000000" w:themeColor="text1"/>
                 <w:lang w:val="es-AR"/>
               </w:rPr>
@@ -441,7 +309,7 @@
             <w:proofErr w:type="spellStart"/>
             <w:r>
               <w:rPr>
-                <w:rFonts w:ascii="Mulish" w:hAnsi="Mulish"/>
+                <w:rFonts w:cstheme="minorHAnsi"/>
                 <w:color w:val="000000" w:themeColor="text1"/>
                 <w:lang w:val="es-AR"/>
               </w:rPr>
@@ -450,7 +318,7 @@
             <w:proofErr w:type="spellEnd"/>
             <w:r>
               <w:rPr>
-                <w:rFonts w:ascii="Mulish" w:hAnsi="Mulish"/>
+                <w:rFonts w:cstheme="minorHAnsi"/>
                 <w:color w:val="000000" w:themeColor="text1"/>
                 <w:lang w:val="es-AR"/>
               </w:rPr>
@@ -459,7 +327,7 @@
             <w:proofErr w:type="spellStart"/>
             <w:r>
               <w:rPr>
-                <w:rFonts w:ascii="Mulish" w:hAnsi="Mulish"/>
+                <w:rFonts w:cstheme="minorHAnsi"/>
                 <w:color w:val="000000" w:themeColor="text1"/>
                 <w:lang w:val="es-AR"/>
               </w:rPr>
@@ -468,7 +336,7 @@
             <w:proofErr w:type="spellEnd"/>
             <w:r>
               <w:rPr>
-                <w:rFonts w:ascii="Mulish" w:hAnsi="Mulish"/>
+                <w:rFonts w:cstheme="minorHAnsi"/>
                 <w:color w:val="000000" w:themeColor="text1"/>
                 <w:lang w:val="es-AR"/>
               </w:rPr>
@@ -477,7 +345,7 @@
             <w:proofErr w:type="spellStart"/>
             <w:r>
               <w:rPr>
-                <w:rFonts w:ascii="Mulish" w:hAnsi="Mulish"/>
+                <w:rFonts w:cstheme="minorHAnsi"/>
                 <w:color w:val="000000" w:themeColor="text1"/>
                 <w:lang w:val="es-AR"/>
               </w:rPr>
@@ -486,7 +354,7 @@
             <w:proofErr w:type="spellEnd"/>
             <w:r>
               <w:rPr>
-                <w:rFonts w:ascii="Mulish" w:hAnsi="Mulish"/>
+                <w:rFonts w:cstheme="minorHAnsi"/>
                 <w:color w:val="000000" w:themeColor="text1"/>
                 <w:lang w:val="es-AR"/>
               </w:rPr>
@@ -495,7 +363,7 @@
             <w:proofErr w:type="spellStart"/>
             <w:r>
               <w:rPr>
-                <w:rFonts w:ascii="Mulish" w:hAnsi="Mulish"/>
+                <w:rFonts w:cstheme="minorHAnsi"/>
                 <w:color w:val="000000" w:themeColor="text1"/>
                 <w:lang w:val="es-AR"/>
               </w:rPr>
@@ -504,7 +372,7 @@
             <w:proofErr w:type="spellEnd"/>
             <w:r>
               <w:rPr>
-                <w:rFonts w:ascii="Mulish" w:hAnsi="Mulish"/>
+                <w:rFonts w:cstheme="minorHAnsi"/>
                 <w:color w:val="000000" w:themeColor="text1"/>
                 <w:lang w:val="es-AR"/>
               </w:rPr>
@@ -523,13 +391,13 @@
             <w:pPr>
               <w:jc w:val="center"/>
               <w:rPr>
-                <w:rFonts w:ascii="Mulish" w:hAnsi="Mulish"/>
+                <w:rFonts w:cstheme="minorHAnsi"/>
                 <w:lang w:val="es-AR"/>
               </w:rPr>
             </w:pPr>
             <w:r>
               <w:rPr>
-                <w:rFonts w:ascii="Mulish" w:hAnsi="Mulish"/>
+                <w:rFonts w:cstheme="minorHAnsi"/>
                 <w:lang w:val="es-AR"/>
               </w:rPr>
               <w:t>{{</w:t>
@@ -538,7 +406,7 @@
             <w:proofErr w:type="gramStart"/>
             <w:r>
               <w:rPr>
-                <w:rFonts w:ascii="Mulish" w:hAnsi="Mulish"/>
+                <w:rFonts w:cstheme="minorHAnsi"/>
                 <w:lang w:val="es-AR"/>
               </w:rPr>
               <w:t>item.Fecha</w:t>
@@ -547,7 +415,7 @@
             <w:proofErr w:type="gramEnd"/>
             <w:r>
               <w:rPr>
-                <w:rFonts w:ascii="Mulish" w:hAnsi="Mulish"/>
+                <w:rFonts w:cstheme="minorHAnsi"/>
                 <w:lang w:val="es-AR"/>
               </w:rPr>
               <w:t>}}</w:t>
@@ -563,13 +431,13 @@
             <w:pPr>
               <w:jc w:val="center"/>
               <w:rPr>
-                <w:rFonts w:ascii="Mulish" w:hAnsi="Mulish"/>
+                <w:rFonts w:cstheme="minorHAnsi"/>
                 <w:lang w:val="es-AR"/>
               </w:rPr>
             </w:pPr>
             <w:r>
               <w:rPr>
-                <w:rFonts w:ascii="Mulish" w:hAnsi="Mulish"/>
+                <w:rFonts w:cstheme="minorHAnsi"/>
                 <w:lang w:val="es-AR"/>
               </w:rPr>
               <w:t>{{</w:t>
@@ -578,7 +446,7 @@
             <w:proofErr w:type="gramStart"/>
             <w:r>
               <w:rPr>
-                <w:rFonts w:ascii="Mulish" w:hAnsi="Mulish"/>
+                <w:rFonts w:cstheme="minorHAnsi"/>
                 <w:lang w:val="es-AR"/>
               </w:rPr>
               <w:t>item.Entrada</w:t>
@@ -587,7 +455,7 @@
             <w:proofErr w:type="gramEnd"/>
             <w:r>
               <w:rPr>
-                <w:rFonts w:ascii="Mulish" w:hAnsi="Mulish"/>
+                <w:rFonts w:cstheme="minorHAnsi"/>
                 <w:lang w:val="es-AR"/>
               </w:rPr>
               <w:t>}}</w:t>
@@ -603,13 +471,13 @@
             <w:pPr>
               <w:jc w:val="center"/>
               <w:rPr>
-                <w:rFonts w:ascii="Mulish" w:hAnsi="Mulish"/>
+                <w:rFonts w:cstheme="minorHAnsi"/>
                 <w:lang w:val="es-AR"/>
               </w:rPr>
             </w:pPr>
             <w:r>
               <w:rPr>
-                <w:rFonts w:ascii="Mulish" w:hAnsi="Mulish"/>
+                <w:rFonts w:cstheme="minorHAnsi"/>
                 <w:lang w:val="es-AR"/>
               </w:rPr>
               <w:t>{{</w:t>
@@ -618,7 +486,7 @@
             <w:proofErr w:type="gramStart"/>
             <w:r>
               <w:rPr>
-                <w:rFonts w:ascii="Mulish" w:hAnsi="Mulish"/>
+                <w:rFonts w:cstheme="minorHAnsi"/>
                 <w:lang w:val="es-AR"/>
               </w:rPr>
               <w:t>item.Salida</w:t>
@@ -627,7 +495,7 @@
             <w:proofErr w:type="gramEnd"/>
             <w:r>
               <w:rPr>
-                <w:rFonts w:ascii="Mulish" w:hAnsi="Mulish"/>
+                <w:rFonts w:cstheme="minorHAnsi"/>
                 <w:lang w:val="es-AR"/>
               </w:rPr>
               <w:t>}}</w:t>
@@ -642,14 +510,13 @@
           <w:p>
             <w:pPr>
               <w:rPr>
-                <w:rFonts w:ascii="Mulish" w:hAnsi="Mulish"/>
+                <w:rFonts w:cstheme="minorHAnsi"/>
                 <w:lang w:val="es-AR"/>
               </w:rPr>
             </w:pPr>
             <w:r>
               <w:rPr>
-                <w:rFonts w:ascii="Mulish" w:hAnsi="Mulish"/>
-                <w:lang w:val="es-AR"/>
+                <w:rFonts w:cstheme="minorHAnsi"/>
               </w:rPr>
               <w:t>{{</w:t>
             </w:r>
@@ -657,8 +524,7 @@
             <w:proofErr w:type="gramStart"/>
             <w:r>
               <w:rPr>
-                <w:rFonts w:ascii="Mulish" w:hAnsi="Mulish"/>
-                <w:lang w:val="es-AR"/>
+                <w:rFonts w:cstheme="minorHAnsi"/>
               </w:rPr>
               <w:t>item.Detalle</w:t>
             </w:r>
@@ -666,8 +532,7 @@
             <w:proofErr w:type="gramEnd"/>
             <w:r>
               <w:rPr>
-                <w:rFonts w:ascii="Mulish" w:hAnsi="Mulish"/>
-                <w:lang w:val="es-AR"/>
+                <w:rFonts w:cstheme="minorHAnsi"/>
               </w:rPr>
               <w:t>}}</w:t>
             </w:r>
@@ -685,14 +550,14 @@
             <w:pPr>
               <w:jc w:val="center"/>
               <w:rPr>
-                <w:rFonts w:ascii="Mulish" w:hAnsi="Mulish"/>
+                <w:rFonts w:cstheme="minorHAnsi"/>
                 <w:color w:val="000000" w:themeColor="text1"/>
                 <w:lang w:val="es-AR"/>
               </w:rPr>
             </w:pPr>
             <w:r>
               <w:rPr>
-                <w:rFonts w:ascii="Mulish" w:hAnsi="Mulish"/>
+                <w:rFonts w:cstheme="minorHAnsi"/>
                 <w:lang w:val="es-AR"/>
               </w:rPr>
               <w:t>{{</w:t>
@@ -701,7 +566,7 @@
             <w:proofErr w:type="gramStart"/>
             <w:r>
               <w:rPr>
-                <w:rFonts w:ascii="Mulish" w:hAnsi="Mulish"/>
+                <w:rFonts w:cstheme="minorHAnsi"/>
                 <w:lang w:val="es-AR"/>
               </w:rPr>
               <w:t>item.Trabajo</w:t>
@@ -710,7 +575,7 @@
             <w:proofErr w:type="gramEnd"/>
             <w:r>
               <w:rPr>
-                <w:rFonts w:ascii="Mulish" w:hAnsi="Mulish"/>
+                <w:rFonts w:cstheme="minorHAnsi"/>
                 <w:lang w:val="es-AR"/>
               </w:rPr>
               <w:t>}}</w:t>
@@ -731,14 +596,14 @@
           <w:p>
             <w:pPr>
               <w:rPr>
-                <w:rFonts w:ascii="Mulish" w:hAnsi="Mulish"/>
+                <w:rFonts w:cstheme="minorHAnsi"/>
                 <w:color w:val="000000" w:themeColor="text1"/>
                 <w:lang w:val="es-AR"/>
               </w:rPr>
             </w:pPr>
             <w:r>
               <w:rPr>
-                <w:rFonts w:ascii="Mulish" w:hAnsi="Mulish"/>
+                <w:rFonts w:cstheme="minorHAnsi"/>
                 <w:color w:val="000000" w:themeColor="text1"/>
                 <w:lang w:val="es-AR"/>
               </w:rPr>
@@ -747,7 +612,7 @@
             <w:proofErr w:type="spellStart"/>
             <w:r>
               <w:rPr>
-                <w:rFonts w:ascii="Mulish" w:hAnsi="Mulish"/>
+                <w:rFonts w:cstheme="minorHAnsi"/>
                 <w:color w:val="000000" w:themeColor="text1"/>
                 <w:lang w:val="es-AR"/>
               </w:rPr>
@@ -756,7 +621,7 @@
             <w:proofErr w:type="spellEnd"/>
             <w:r>
               <w:rPr>
-                <w:rFonts w:ascii="Mulish" w:hAnsi="Mulish"/>
+                <w:rFonts w:cstheme="minorHAnsi"/>
                 <w:color w:val="000000" w:themeColor="text1"/>
                 <w:lang w:val="es-AR"/>
               </w:rPr>
@@ -765,7 +630,7 @@
             <w:proofErr w:type="spellStart"/>
             <w:r>
               <w:rPr>
-                <w:rFonts w:ascii="Mulish" w:hAnsi="Mulish"/>
+                <w:rFonts w:cstheme="minorHAnsi"/>
                 <w:color w:val="000000" w:themeColor="text1"/>
                 <w:lang w:val="es-AR"/>
               </w:rPr>
@@ -774,7 +639,7 @@
             <w:proofErr w:type="spellEnd"/>
             <w:r>
               <w:rPr>
-                <w:rFonts w:ascii="Mulish" w:hAnsi="Mulish"/>
+                <w:rFonts w:cstheme="minorHAnsi"/>
                 <w:color w:val="000000" w:themeColor="text1"/>
                 <w:lang w:val="es-AR"/>
               </w:rPr>
@@ -796,7 +661,7 @@
             <w:pPr>
               <w:jc w:val="right"/>
               <w:rPr>
-                <w:rFonts w:ascii="Mulish" w:hAnsi="Mulish"/>
+                <w:rFonts w:cstheme="minorHAnsi"/>
                 <w:color w:val="000000" w:themeColor="text1"/>
                 <w:lang w:val="es-AR"/>
               </w:rPr>
@@ -804,7 +669,7 @@
             <w:proofErr w:type="gramStart"/>
             <w:r>
               <w:rPr>
-                <w:rFonts w:ascii="Mulish" w:hAnsi="Mulish"/>
+                <w:rFonts w:cstheme="minorHAnsi"/>
                 <w:b/>
                 <w:lang w:val="es-AR"/>
               </w:rPr>
@@ -813,7 +678,7 @@
             <w:proofErr w:type="gramEnd"/>
             <w:r>
               <w:rPr>
-                <w:rFonts w:ascii="Mulish" w:hAnsi="Mulish"/>
+                <w:rFonts w:cstheme="minorHAnsi"/>
                 <w:b/>
                 <w:lang w:val="es-AR"/>
               </w:rPr>
@@ -832,78 +697,37 @@
             <w:pPr>
               <w:jc w:val="center"/>
               <w:rPr>
-                <w:rFonts w:ascii="Mulish" w:hAnsi="Mulish"/>
-                <w:b/>
-                <w:bCs/>
+                <w:rFonts w:cstheme="minorHAnsi"/>
                 <w:color w:val="000000" w:themeColor="text1"/>
                 <w:lang w:val="es-AR"/>
               </w:rPr>
             </w:pPr>
             <w:r>
               <w:rPr>
-                <w:rFonts w:ascii="Mulish" w:hAnsi="Mulish"/>
-                <w:b/>
-                <w:bCs/>
-                <w:lang w:val="es-AR"/>
-              </w:rPr>
-              <w:t>{%</w:t>
+                <w:rFonts w:cstheme="minorHAnsi"/>
+                <w:lang w:val="es-AR"/>
+              </w:rPr>
+              <w:t>{{</w:t>
+            </w:r>
+            <w:r>
+              <w:rPr>
+                <w:rFonts w:cstheme="minorHAnsi"/>
+                <w:lang w:val="es-AR"/>
+              </w:rPr>
+              <w:t xml:space="preserve">r </w:t>
             </w:r>
             <w:proofErr w:type="spellStart"/>
             <w:r>
               <w:rPr>
-                <w:rFonts w:ascii="Mulish" w:hAnsi="Mulish"/>
-                <w:b/>
-                <w:bCs/>
-                <w:lang w:val="es-AR"/>
-              </w:rPr>
-              <w:t>cellbg</w:t>
+                <w:rFonts w:cstheme="minorHAnsi"/>
+                <w:lang w:val="es-AR"/>
+              </w:rPr>
+              <w:t>horas_trabajadas</w:t>
             </w:r>
             <w:proofErr w:type="spellEnd"/>
             <w:r>
               <w:rPr>
-                <w:rFonts w:ascii="Mulish" w:hAnsi="Mulish"/>
-                <w:b/>
-                <w:bCs/>
-                <w:lang w:val="es-AR"/>
-              </w:rPr>
-              <w:t xml:space="preserve"> color</w:t>
-            </w:r>
-            <w:proofErr w:type="gramStart"/>
-            <w:r>
-              <w:rPr>
-                <w:rFonts w:ascii="Mulish" w:hAnsi="Mulish"/>
-                <w:b/>
-                <w:bCs/>
-                <w:lang w:val="es-AR"/>
-              </w:rPr>
-              <w:t>%}{</w:t>
-            </w:r>
-            <w:proofErr w:type="gramEnd"/>
-            <w:r>
-              <w:rPr>
-                <w:rFonts w:ascii="Mulish" w:hAnsi="Mulish"/>
-                <w:b/>
-                <w:bCs/>
-                <w:lang w:val="es-AR"/>
-              </w:rPr>
-              <w:t>{</w:t>
-            </w:r>
-            <w:proofErr w:type="spellStart"/>
-            <w:r>
-              <w:rPr>
-                <w:rFonts w:ascii="Mulish" w:hAnsi="Mulish"/>
-                <w:b/>
-                <w:bCs/>
-                <w:lang w:val="es-AR"/>
-              </w:rPr>
-              <w:t>horas_trabajadas</w:t>
-            </w:r>
-            <w:proofErr w:type="spellEnd"/>
-            <w:r>
-              <w:rPr>
-                <w:rFonts w:ascii="Mulish" w:hAnsi="Mulish"/>
-                <w:b/>
-                <w:bCs/>
+                <w:rFonts w:cstheme="minorHAnsi"/>
                 <w:lang w:val="es-AR"/>
               </w:rPr>
               <w:t>}}</w:t>
@@ -916,7 +740,7 @@
       <w:pPr>
         <w:spacing w:after="0"/>
         <w:rPr>
-          <w:rFonts w:ascii="Mulish" w:hAnsi="Mulish"/>
+          <w:rFonts w:cstheme="minorHAnsi"/>
           <w:lang w:val="es-AR"/>
         </w:rPr>
       </w:pPr>
@@ -944,20 +768,20 @@
             <w:pPr>
               <w:jc w:val="center"/>
               <w:rPr>
-                <w:rFonts w:ascii="Mulish" w:hAnsi="Mulish"/>
+                <w:rFonts w:cstheme="minorHAnsi"/>
                 <w:lang w:val="es-AR"/>
               </w:rPr>
             </w:pPr>
             <w:r>
               <w:rPr>
-                <w:rFonts w:ascii="Mulish" w:hAnsi="Mulish"/>
+                <w:rFonts w:cstheme="minorHAnsi"/>
                 <w:lang w:val="es-AR"/>
               </w:rPr>
               <w:br w:type="page"/>
             </w:r>
             <w:r>
               <w:rPr>
-                <w:rFonts w:ascii="Mulish" w:hAnsi="Mulish"/>
+                <w:rFonts w:cstheme="minorHAnsi"/>
                 <w:b/>
                 <w:lang w:val="es-AR"/>
               </w:rPr>
@@ -979,98 +803,29 @@
             <w:pPr>
               <w:spacing w:before="240"/>
               <w:rPr>
-                <w:rFonts w:ascii="Mulish" w:hAnsi="Mulish"/>
+                <w:rFonts w:cstheme="minorHAnsi"/>
                 <w:lang w:val="es-AR"/>
               </w:rPr>
             </w:pPr>
             <w:r>
               <w:rPr>
-                <w:rFonts w:ascii="Mulish" w:hAnsi="Mulish"/>
-                <w:lang w:val="es-AR"/>
-              </w:rPr>
-              <w:t>El agente {{</w:t>
-            </w:r>
-            <w:proofErr w:type="spellStart"/>
-            <w:r>
-              <w:rPr>
-                <w:rFonts w:ascii="Mulish" w:hAnsi="Mulish"/>
-                <w:lang w:val="es-AR"/>
-              </w:rPr>
-              <w:t>nombre_empleado</w:t>
-            </w:r>
-            <w:proofErr w:type="spellEnd"/>
-            <w:r>
-              <w:rPr>
-                <w:rFonts w:ascii="Mulish" w:hAnsi="Mulish"/>
-                <w:lang w:val="es-AR"/>
-              </w:rPr>
-              <w:t>}} durante el mes de {{periodo}} trabajó en total {{</w:t>
-            </w:r>
-            <w:proofErr w:type="spellStart"/>
-            <w:r>
-              <w:rPr>
-                <w:rFonts w:ascii="Mulish" w:hAnsi="Mulish"/>
-                <w:lang w:val="es-AR"/>
-              </w:rPr>
-              <w:t>horas_trabajadas</w:t>
-            </w:r>
-            <w:proofErr w:type="spellEnd"/>
-            <w:r>
-              <w:rPr>
-                <w:rFonts w:ascii="Mulish" w:hAnsi="Mulish"/>
-                <w:lang w:val="es-AR"/>
-              </w:rPr>
-              <w:t>}} siendo el total de horas mínimas a cumplir de {{</w:t>
-            </w:r>
-            <w:proofErr w:type="spellStart"/>
-            <w:r>
-              <w:rPr>
-                <w:rFonts w:ascii="Mulish" w:hAnsi="Mulish"/>
-                <w:lang w:val="es-AR"/>
-              </w:rPr>
-              <w:t>horas_minimas</w:t>
-            </w:r>
-            <w:proofErr w:type="spellEnd"/>
-            <w:r>
-              <w:rPr>
-                <w:rFonts w:ascii="Mulish" w:hAnsi="Mulish"/>
-                <w:lang w:val="es-AR"/>
-              </w:rPr>
-              <w:t>}}</w:t>
-            </w:r>
-            <w:r>
-              <w:rPr>
-                <w:rFonts w:ascii="Mulish" w:hAnsi="Mulish"/>
-                <w:lang w:val="es-AR"/>
-              </w:rPr>
-              <w:t xml:space="preserve"> </w:t>
-            </w:r>
-            <w:r>
-              <w:rPr>
-                <w:rFonts w:ascii="Mulish" w:hAnsi="Mulish"/>
-                <w:lang w:val="es-AR"/>
-              </w:rPr>
-              <w:t xml:space="preserve">y </w:t>
-            </w:r>
-            <w:r>
-              <w:rPr>
-                <w:rFonts w:ascii="Mulish" w:hAnsi="Mulish"/>
-                <w:lang w:val="es-AR"/>
-              </w:rPr>
-              <w:t>la diferencia es de {{diferencia}}</w:t>
+                <w:rFonts w:cstheme="minorHAnsi"/>
+                <w:lang w:val="es-AR"/>
+              </w:rPr>
+              <w:t>{{comentario}}</w:t>
             </w:r>
           </w:p>
           <w:p>
             <w:pPr>
               <w:spacing w:before="240"/>
               <w:rPr>
-                <w:rFonts w:ascii="Mulish" w:hAnsi="Mulish"/>
+                <w:rFonts w:cstheme="minorHAnsi"/>
                 <w:lang w:val="es-AR"/>
               </w:rPr>
             </w:pPr>
             <w:r>
               <w:rPr>
-                <w:rFonts w:ascii="Mulish" w:hAnsi="Mulish"/>
+                <w:rFonts w:cstheme="minorHAnsi"/>
                 <w:lang w:val="es-AR"/>
               </w:rPr>
               <w:t xml:space="preserve">En caso de tener alguna observación para realizar, le pedimos que lo haga por correo electrónico a </w:t>
@@ -1079,7 +834,7 @@
               <w:r>
                 <w:rPr>
                   <w:rStyle w:val="Hipervnculo"/>
-                  <w:rFonts w:ascii="Mulish" w:hAnsi="Mulish"/>
+                  <w:rFonts w:cstheme="minorHAnsi"/>
                   <w:lang w:val="es-AR"/>
                 </w:rPr>
                 <w:t>reportes@automatizacion_con_python.com</w:t>
@@ -1100,7 +855,7 @@
           <w:p>
             <w:pPr>
               <w:rPr>
-                <w:rFonts w:ascii="Mulish" w:hAnsi="Mulish"/>
+                <w:rFonts w:cstheme="minorHAnsi"/>
                 <w:lang w:val="es-AR"/>
               </w:rPr>
             </w:pPr>
@@ -1112,7 +867,712 @@
       <w:pPr>
         <w:spacing w:before="240"/>
         <w:rPr>
-          <w:rFonts w:ascii="Mulish" w:hAnsi="Mulish"/>
+          <w:rFonts w:cstheme="minorHAnsi"/>
+          <w:b/>
+          <w:bCs/>
+        </w:rPr>
+      </w:pPr>
+    </w:p>
+    <w:p>
+      <w:pPr>
+        <w:rPr>
+          <w:rFonts w:cstheme="minorHAnsi"/>
+          <w:b/>
+          <w:bCs/>
+        </w:rPr>
+      </w:pPr>
+      <w:r>
+        <w:rPr>
+          <w:rFonts w:cstheme="minorHAnsi"/>
+          <w:b/>
+          <w:bCs/>
+        </w:rPr>
+        <w:br w:type="page"/>
+      </w:r>
+    </w:p>
+    <w:p>
+      <w:pPr>
+        <w:spacing w:before="240"/>
+        <w:rPr>
+          <w:rFonts w:cstheme="minorHAnsi"/>
+          <w:b/>
+          <w:bCs/>
+          <w:sz w:val="32"/>
+          <w:szCs w:val="32"/>
+        </w:rPr>
+      </w:pPr>
+      <w:r>
+        <w:rPr>
+          <w:rFonts w:cstheme="minorHAnsi"/>
+          <w:b/>
+          <w:bCs/>
+          <w:sz w:val="32"/>
+          <w:szCs w:val="32"/>
+        </w:rPr>
+        <w:lastRenderedPageBreak/>
+        <w:t>MÉTRICAS</w:t>
+      </w:r>
+    </w:p>
+    <w:p>
+      <w:pPr>
+        <w:spacing w:after="0"/>
+        <w:rPr>
+          <w:rFonts w:cstheme="minorHAnsi"/>
+          <w:lang w:val="es-AR"/>
+        </w:rPr>
+      </w:pPr>
+      <w:r>
+        <w:rPr>
+          <w:rFonts w:cstheme="minorHAnsi"/>
+          <w:b/>
+          <w:bCs/>
+          <w:lang w:val="es-AR"/>
+        </w:rPr>
+        <w:t>Horas Trabajadas:</w:t>
+      </w:r>
+      <w:r>
+        <w:rPr>
+          <w:rFonts w:cstheme="minorHAnsi"/>
+          <w:lang w:val="es-AR"/>
+        </w:rPr>
+        <w:t xml:space="preserve"> {{</w:t>
+      </w:r>
+      <w:proofErr w:type="spellStart"/>
+      <w:r>
+        <w:rPr>
+          <w:rFonts w:cstheme="minorHAnsi"/>
+          <w:lang w:val="es-AR"/>
+        </w:rPr>
+        <w:t>horas_trabajadas</w:t>
+      </w:r>
+      <w:proofErr w:type="spellEnd"/>
+      <w:r>
+        <w:rPr>
+          <w:rFonts w:cstheme="minorHAnsi"/>
+          <w:lang w:val="es-AR"/>
+        </w:rPr>
+        <w:t>}}</w:t>
+      </w:r>
+    </w:p>
+    <w:p>
+      <w:pPr>
+        <w:spacing w:after="0"/>
+        <w:rPr>
+          <w:rFonts w:cstheme="minorHAnsi"/>
+          <w:lang w:val="es-AR"/>
+        </w:rPr>
+      </w:pPr>
+      <w:r>
+        <w:rPr>
+          <w:rFonts w:cstheme="minorHAnsi"/>
+          <w:b/>
+          <w:bCs/>
+          <w:lang w:val="es-AR"/>
+        </w:rPr>
+        <w:t>Horas Mínimas por Trabajar:</w:t>
+      </w:r>
+      <w:r>
+        <w:rPr>
+          <w:rFonts w:cstheme="minorHAnsi"/>
+          <w:lang w:val="es-AR"/>
+        </w:rPr>
+        <w:t xml:space="preserve"> {{</w:t>
+      </w:r>
+      <w:proofErr w:type="spellStart"/>
+      <w:r>
+        <w:rPr>
+          <w:rFonts w:cstheme="minorHAnsi"/>
+          <w:lang w:val="es-AR"/>
+        </w:rPr>
+        <w:t>horas_minimas</w:t>
+      </w:r>
+      <w:proofErr w:type="spellEnd"/>
+      <w:r>
+        <w:rPr>
+          <w:rFonts w:cstheme="minorHAnsi"/>
+          <w:lang w:val="es-AR"/>
+        </w:rPr>
+        <w:t>}}</w:t>
+      </w:r>
+    </w:p>
+    <w:p>
+      <w:pPr>
+        <w:spacing w:after="0"/>
+        <w:rPr>
+          <w:rFonts w:cstheme="minorHAnsi"/>
+          <w:lang w:val="es-AR"/>
+        </w:rPr>
+      </w:pPr>
+      <w:r>
+        <w:rPr>
+          <w:rFonts w:cstheme="minorHAnsi"/>
+          <w:b/>
+          <w:bCs/>
+          <w:lang w:val="es-AR"/>
+        </w:rPr>
+        <w:t>Diferencia:</w:t>
+      </w:r>
+      <w:r>
+        <w:rPr>
+          <w:rFonts w:cstheme="minorHAnsi"/>
+          <w:lang w:val="es-AR"/>
+        </w:rPr>
+        <w:t xml:space="preserve"> {{diferencia}}</w:t>
+      </w:r>
+    </w:p>
+    <w:p>
+      <w:pPr>
+        <w:spacing w:after="0"/>
+        <w:rPr>
+          <w:rFonts w:cstheme="minorHAnsi"/>
+          <w:lang w:val="es-AR"/>
+        </w:rPr>
+      </w:pPr>
+    </w:p>
+    <w:p>
+      <w:pPr>
+        <w:spacing w:after="0"/>
+        <w:rPr>
+          <w:rFonts w:cstheme="minorHAnsi"/>
+          <w:lang w:val="es-AR"/>
+        </w:rPr>
+      </w:pPr>
+      <w:r>
+        <w:rPr>
+          <w:rFonts w:cstheme="minorHAnsi"/>
+          <w:b/>
+          <w:bCs/>
+          <w:lang w:val="es-AR"/>
+        </w:rPr>
+        <w:t>% de Cumplimiento:</w:t>
+      </w:r>
+      <w:r>
+        <w:rPr>
+          <w:rFonts w:cstheme="minorHAnsi"/>
+          <w:lang w:val="es-AR"/>
+        </w:rPr>
+        <w:t xml:space="preserve"> {{cumplimiento}}</w:t>
+      </w:r>
+    </w:p>
+    <w:p>
+      <w:pPr>
+        <w:spacing w:after="0"/>
+        <w:rPr>
+          <w:rFonts w:cstheme="minorHAnsi"/>
+          <w:lang w:val="es-AR"/>
+        </w:rPr>
+      </w:pPr>
+      <w:r>
+        <w:rPr>
+          <w:rFonts w:cstheme="minorHAnsi"/>
+          <w:b/>
+          <w:bCs/>
+          <w:lang w:val="es-AR"/>
+        </w:rPr>
+        <w:t>Promedio diario:</w:t>
+      </w:r>
+      <w:r>
+        <w:rPr>
+          <w:rFonts w:cstheme="minorHAnsi"/>
+          <w:lang w:val="es-AR"/>
+        </w:rPr>
+        <w:t xml:space="preserve"> {{promedio}}</w:t>
+      </w:r>
+    </w:p>
+    <w:p>
+      <w:pPr>
+        <w:spacing w:after="0"/>
+        <w:rPr>
+          <w:rFonts w:cstheme="minorHAnsi"/>
+          <w:lang w:val="es-AR"/>
+        </w:rPr>
+      </w:pPr>
+      <w:r>
+        <w:rPr>
+          <w:rFonts w:cstheme="minorHAnsi"/>
+          <w:b/>
+          <w:bCs/>
+          <w:lang w:val="es-AR"/>
+        </w:rPr>
+        <w:t>Estado:</w:t>
+      </w:r>
+      <w:r>
+        <w:rPr>
+          <w:rFonts w:cstheme="minorHAnsi"/>
+          <w:lang w:val="es-AR"/>
+        </w:rPr>
+        <w:t xml:space="preserve"> {{estado}}</w:t>
+      </w:r>
+    </w:p>
+    <w:p>
+      <w:pPr>
+        <w:spacing w:after="0"/>
+        <w:rPr>
+          <w:rFonts w:cstheme="minorHAnsi"/>
+          <w:lang w:val="es-AR"/>
+        </w:rPr>
+      </w:pPr>
+    </w:p>
+    <w:p>
+      <w:pPr>
+        <w:spacing w:after="0"/>
+        <w:rPr>
+          <w:rFonts w:cstheme="minorHAnsi"/>
+          <w:lang w:val="es-AR"/>
+        </w:rPr>
+      </w:pPr>
+      <w:r>
+        <w:rPr>
+          <w:rFonts w:cstheme="minorHAnsi"/>
+          <w:b/>
+          <w:bCs/>
+          <w:lang w:val="es-AR"/>
+        </w:rPr>
+        <w:t xml:space="preserve">Días </w:t>
+      </w:r>
+      <w:r>
+        <w:rPr>
+          <w:rFonts w:cstheme="minorHAnsi"/>
+          <w:b/>
+          <w:bCs/>
+          <w:lang w:val="es-AR"/>
+        </w:rPr>
+        <w:t xml:space="preserve">&gt; </w:t>
+      </w:r>
+      <w:r>
+        <w:rPr>
+          <w:rFonts w:cstheme="minorHAnsi"/>
+          <w:b/>
+          <w:bCs/>
+          <w:lang w:val="es-AR"/>
+        </w:rPr>
+        <w:t xml:space="preserve">4 </w:t>
+      </w:r>
+      <w:proofErr w:type="spellStart"/>
+      <w:r>
+        <w:rPr>
+          <w:rFonts w:cstheme="minorHAnsi"/>
+          <w:b/>
+          <w:bCs/>
+          <w:lang w:val="es-AR"/>
+        </w:rPr>
+        <w:t>hs</w:t>
+      </w:r>
+      <w:proofErr w:type="spellEnd"/>
+      <w:r>
+        <w:rPr>
+          <w:rFonts w:cstheme="minorHAnsi"/>
+          <w:b/>
+          <w:bCs/>
+          <w:lang w:val="es-AR"/>
+        </w:rPr>
+        <w:t xml:space="preserve"> trabajadas</w:t>
+      </w:r>
+      <w:r>
+        <w:rPr>
+          <w:rFonts w:cstheme="minorHAnsi"/>
+          <w:b/>
+          <w:bCs/>
+          <w:lang w:val="es-AR"/>
+        </w:rPr>
+        <w:t>:</w:t>
+      </w:r>
+      <w:r>
+        <w:rPr>
+          <w:rFonts w:cstheme="minorHAnsi"/>
+          <w:lang w:val="es-AR"/>
+        </w:rPr>
+        <w:t xml:space="preserve"> {{</w:t>
+      </w:r>
+      <w:proofErr w:type="spellStart"/>
+      <w:r>
+        <w:rPr>
+          <w:rFonts w:cstheme="minorHAnsi"/>
+          <w:lang w:val="es-AR"/>
+        </w:rPr>
+        <w:t>dias_bajos</w:t>
+      </w:r>
+      <w:proofErr w:type="spellEnd"/>
+      <w:r>
+        <w:rPr>
+          <w:rFonts w:cstheme="minorHAnsi"/>
+          <w:lang w:val="es-AR"/>
+        </w:rPr>
+        <w:t>}}</w:t>
+      </w:r>
+    </w:p>
+    <w:p>
+      <w:pPr>
+        <w:spacing w:after="0"/>
+        <w:rPr>
+          <w:rFonts w:cstheme="minorHAnsi"/>
+          <w:lang w:val="es-AR"/>
+        </w:rPr>
+      </w:pPr>
+      <w:r>
+        <w:rPr>
+          <w:rFonts w:cstheme="minorHAnsi"/>
+          <w:b/>
+          <w:bCs/>
+          <w:lang w:val="es-AR"/>
+        </w:rPr>
+        <w:t xml:space="preserve">Días </w:t>
+      </w:r>
+      <w:r>
+        <w:rPr>
+          <w:rFonts w:cstheme="minorHAnsi"/>
+          <w:b/>
+          <w:bCs/>
+          <w:lang w:val="es-AR"/>
+        </w:rPr>
+        <w:t xml:space="preserve">&lt; </w:t>
+      </w:r>
+      <w:r>
+        <w:rPr>
+          <w:rFonts w:cstheme="minorHAnsi"/>
+          <w:b/>
+          <w:bCs/>
+          <w:lang w:val="es-AR"/>
+        </w:rPr>
+        <w:t>9</w:t>
+      </w:r>
+      <w:r>
+        <w:rPr>
+          <w:rFonts w:cstheme="minorHAnsi"/>
+          <w:b/>
+          <w:bCs/>
+          <w:lang w:val="es-AR"/>
+        </w:rPr>
+        <w:t xml:space="preserve"> </w:t>
+      </w:r>
+      <w:proofErr w:type="spellStart"/>
+      <w:r>
+        <w:rPr>
+          <w:rFonts w:cstheme="minorHAnsi"/>
+          <w:b/>
+          <w:bCs/>
+          <w:lang w:val="es-AR"/>
+        </w:rPr>
+        <w:t>hs</w:t>
+      </w:r>
+      <w:proofErr w:type="spellEnd"/>
+      <w:r>
+        <w:rPr>
+          <w:rFonts w:cstheme="minorHAnsi"/>
+          <w:b/>
+          <w:bCs/>
+          <w:lang w:val="es-AR"/>
+        </w:rPr>
+        <w:t xml:space="preserve"> trabajadas</w:t>
+      </w:r>
+      <w:r>
+        <w:rPr>
+          <w:rFonts w:cstheme="minorHAnsi"/>
+          <w:b/>
+          <w:bCs/>
+          <w:lang w:val="es-AR"/>
+        </w:rPr>
+        <w:t>:</w:t>
+      </w:r>
+      <w:r>
+        <w:rPr>
+          <w:rFonts w:cstheme="minorHAnsi"/>
+          <w:lang w:val="es-AR"/>
+        </w:rPr>
+        <w:t xml:space="preserve"> {{</w:t>
+      </w:r>
+      <w:proofErr w:type="spellStart"/>
+      <w:r>
+        <w:rPr>
+          <w:rFonts w:cstheme="minorHAnsi"/>
+          <w:lang w:val="es-AR"/>
+        </w:rPr>
+        <w:t>dias_altos</w:t>
+      </w:r>
+      <w:proofErr w:type="spellEnd"/>
+      <w:r>
+        <w:rPr>
+          <w:rFonts w:cstheme="minorHAnsi"/>
+          <w:lang w:val="es-AR"/>
+        </w:rPr>
+        <w:t>}}</w:t>
+      </w:r>
+    </w:p>
+    <w:p>
+      <w:pPr>
+        <w:spacing w:after="0"/>
+        <w:rPr>
+          <w:rFonts w:cstheme="minorHAnsi"/>
+          <w:lang w:val="es-AR"/>
+        </w:rPr>
+      </w:pPr>
+      <w:r>
+        <w:rPr>
+          <w:rFonts w:cstheme="minorHAnsi"/>
+          <w:b/>
+          <w:bCs/>
+          <w:lang w:val="es-AR"/>
+        </w:rPr>
+        <w:t>Días con registro incompleto:</w:t>
+      </w:r>
+      <w:r>
+        <w:rPr>
+          <w:rFonts w:cstheme="minorHAnsi"/>
+          <w:lang w:val="es-AR"/>
+        </w:rPr>
+        <w:t xml:space="preserve"> {{</w:t>
+      </w:r>
+      <w:proofErr w:type="spellStart"/>
+      <w:r>
+        <w:rPr>
+          <w:rFonts w:cstheme="minorHAnsi"/>
+          <w:lang w:val="es-AR"/>
+        </w:rPr>
+        <w:t>faltas_registro</w:t>
+      </w:r>
+      <w:proofErr w:type="spellEnd"/>
+      <w:r>
+        <w:rPr>
+          <w:rFonts w:cstheme="minorHAnsi"/>
+          <w:lang w:val="es-AR"/>
+        </w:rPr>
+        <w:t>}}</w:t>
+      </w:r>
+    </w:p>
+    <w:p>
+      <w:pPr>
+        <w:spacing w:before="240"/>
+        <w:rPr>
+          <w:rFonts w:cstheme="minorHAnsi"/>
+          <w:b/>
+          <w:bCs/>
+          <w:lang w:val="es-AR"/>
+        </w:rPr>
+      </w:pPr>
+    </w:p>
+    <w:p>
+      <w:pPr>
+        <w:rPr>
+          <w:rFonts w:cstheme="minorHAnsi"/>
+          <w:b/>
+          <w:bCs/>
+        </w:rPr>
+      </w:pPr>
+      <w:r>
+        <w:rPr>
+          <w:rFonts w:cstheme="minorHAnsi"/>
+          <w:b/>
+          <w:bCs/>
+        </w:rPr>
+        <w:br w:type="page"/>
+      </w:r>
+    </w:p>
+    <w:p>
+      <w:pPr>
+        <w:spacing w:before="240"/>
+        <w:rPr>
+          <w:rFonts w:cstheme="minorHAnsi"/>
+          <w:b/>
+          <w:bCs/>
+          <w:sz w:val="32"/>
+          <w:szCs w:val="32"/>
+        </w:rPr>
+      </w:pPr>
+      <w:r>
+        <w:rPr>
+          <w:rFonts w:cstheme="minorHAnsi"/>
+          <w:b/>
+          <w:bCs/>
+          <w:sz w:val="32"/>
+          <w:szCs w:val="32"/>
+        </w:rPr>
+        <w:lastRenderedPageBreak/>
+        <w:t>HORAS</w:t>
+      </w:r>
+      <w:r>
+        <w:rPr>
+          <w:rFonts w:cstheme="minorHAnsi"/>
+          <w:b/>
+          <w:bCs/>
+          <w:sz w:val="32"/>
+          <w:szCs w:val="32"/>
+        </w:rPr>
+        <w:t xml:space="preserve"> TRABAJADAS</w:t>
+      </w:r>
+      <w:r>
+        <w:rPr>
+          <w:rFonts w:cstheme="minorHAnsi"/>
+          <w:b/>
+          <w:bCs/>
+          <w:sz w:val="32"/>
+          <w:szCs w:val="32"/>
+        </w:rPr>
+        <w:t xml:space="preserve"> POR DÍA</w:t>
+      </w:r>
+    </w:p>
+    <w:p>
+      <w:pPr>
+        <w:spacing w:before="240"/>
+        <w:rPr>
+          <w:rFonts w:cstheme="minorHAnsi"/>
+        </w:rPr>
+      </w:pPr>
+      <w:r>
+        <w:rPr>
+          <w:rFonts w:cstheme="minorHAnsi"/>
+        </w:rPr>
+        <w:t>{{grafico}}</w:t>
+      </w:r>
+    </w:p>
+    <w:p>
+      <w:pPr>
+        <w:spacing w:before="240"/>
+        <w:rPr>
+          <w:rFonts w:cstheme="minorHAnsi"/>
+        </w:rPr>
+      </w:pPr>
+    </w:p>
+    <w:p>
+      <w:pPr>
+        <w:rPr>
+          <w:rFonts w:cstheme="minorHAnsi"/>
+          <w:b/>
+          <w:bCs/>
+        </w:rPr>
+      </w:pPr>
+      <w:r>
+        <w:rPr>
+          <w:rFonts w:cstheme="minorHAnsi"/>
+          <w:b/>
+          <w:bCs/>
+        </w:rPr>
+        <w:br w:type="page"/>
+      </w:r>
+    </w:p>
+    <w:p>
+      <w:pPr>
+        <w:spacing w:before="240"/>
+        <w:rPr>
+          <w:rFonts w:cstheme="minorHAnsi"/>
+          <w:b/>
+          <w:bCs/>
+          <w:sz w:val="32"/>
+          <w:szCs w:val="32"/>
+        </w:rPr>
+      </w:pPr>
+      <w:r>
+        <w:rPr>
+          <w:rFonts w:cstheme="minorHAnsi"/>
+          <w:b/>
+          <w:bCs/>
+          <w:sz w:val="32"/>
+          <w:szCs w:val="32"/>
+        </w:rPr>
+        <w:lastRenderedPageBreak/>
+        <w:t xml:space="preserve">PROMEDIO </w:t>
+      </w:r>
+      <w:r>
+        <w:rPr>
+          <w:rFonts w:cstheme="minorHAnsi"/>
+          <w:b/>
+          <w:bCs/>
+          <w:sz w:val="32"/>
+          <w:szCs w:val="32"/>
+        </w:rPr>
+        <w:t xml:space="preserve">DE HORAS TRABAJADAS </w:t>
+      </w:r>
+      <w:r>
+        <w:rPr>
+          <w:rFonts w:cstheme="minorHAnsi"/>
+          <w:b/>
+          <w:bCs/>
+          <w:sz w:val="32"/>
+          <w:szCs w:val="32"/>
+        </w:rPr>
+        <w:t>POR DÍA DE SEMANA</w:t>
+      </w:r>
+    </w:p>
+    <w:p>
+      <w:pPr>
+        <w:spacing w:before="240"/>
+        <w:rPr>
+          <w:rFonts w:cstheme="minorHAnsi"/>
+        </w:rPr>
+      </w:pPr>
+      <w:r>
+        <w:rPr>
+          <w:rFonts w:cstheme="minorHAnsi"/>
+        </w:rPr>
+        <w:t>{{grafico2}}</w:t>
+      </w:r>
+    </w:p>
+    <w:p>
+      <w:pPr>
+        <w:spacing w:before="240"/>
+        <w:rPr>
+          <w:rFonts w:cstheme="minorHAnsi"/>
+        </w:rPr>
+      </w:pPr>
+    </w:p>
+    <w:p>
+      <w:pPr>
+        <w:rPr>
+          <w:rFonts w:cstheme="minorHAnsi"/>
+          <w:b/>
+          <w:bCs/>
+        </w:rPr>
+      </w:pPr>
+      <w:r>
+        <w:rPr>
+          <w:rFonts w:cstheme="minorHAnsi"/>
+          <w:b/>
+          <w:bCs/>
+        </w:rPr>
+        <w:br w:type="page"/>
+      </w:r>
+    </w:p>
+    <w:p>
+      <w:pPr>
+        <w:spacing w:before="240"/>
+        <w:rPr>
+          <w:rFonts w:cstheme="minorHAnsi"/>
+          <w:b/>
+          <w:bCs/>
+          <w:sz w:val="32"/>
+          <w:szCs w:val="32"/>
+        </w:rPr>
+      </w:pPr>
+      <w:r>
+        <w:rPr>
+          <w:rFonts w:cstheme="minorHAnsi"/>
+          <w:b/>
+          <w:bCs/>
+          <w:sz w:val="32"/>
+          <w:szCs w:val="32"/>
+        </w:rPr>
+        <w:lastRenderedPageBreak/>
+        <w:t>DISTRIBUCION DE HORAS (HISTOGRAMA)</w:t>
+      </w:r>
+    </w:p>
+    <w:p>
+      <w:pPr>
+        <w:spacing w:before="240"/>
+        <w:rPr>
+          <w:rFonts w:cstheme="minorHAnsi"/>
+        </w:rPr>
+      </w:pPr>
+      <w:r>
+        <w:rPr>
+          <w:rFonts w:cstheme="minorHAnsi"/>
+        </w:rPr>
+        <w:t>{{grafico3}}</w:t>
+      </w:r>
+    </w:p>
+    <w:p>
+      <w:pPr>
+        <w:spacing w:before="240"/>
+        <w:rPr>
+          <w:rFonts w:cstheme="minorHAnsi"/>
         </w:rPr>
       </w:pPr>
     </w:p>

</xml_diff>

<commit_message>
agregando opcion para no incluir graficos y mejoras en los graficos
</commit_message>
<xml_diff>
--- a/inputs/plantilla_horas.docx
+++ b/inputs/plantilla_horas.docx
@@ -104,27 +104,7 @@
           <w:szCs w:val="28"/>
           <w:lang w:val="es-AR"/>
         </w:rPr>
-        <w:t xml:space="preserve"> {{</w:t>
-      </w:r>
-      <w:proofErr w:type="spellStart"/>
-      <w:r>
-        <w:rPr>
-          <w:rFonts w:cstheme="minorHAnsi"/>
-          <w:sz w:val="28"/>
-          <w:szCs w:val="28"/>
-          <w:lang w:val="es-AR"/>
-        </w:rPr>
-        <w:t>nombre_empleado</w:t>
-      </w:r>
-      <w:proofErr w:type="spellEnd"/>
-      <w:r>
-        <w:rPr>
-          <w:rFonts w:cstheme="minorHAnsi"/>
-          <w:sz w:val="28"/>
-          <w:szCs w:val="28"/>
-          <w:lang w:val="es-AR"/>
-        </w:rPr>
-        <w:t>}}</w:t>
+        <w:t xml:space="preserve"> {{nombre_empleado}}</w:t>
       </w:r>
     </w:p>
     <w:p>
@@ -304,79 +284,7 @@
                 <w:color w:val="000000" w:themeColor="text1"/>
                 <w:lang w:val="es-AR"/>
               </w:rPr>
-              <w:t>{%</w:t>
-            </w:r>
-            <w:proofErr w:type="spellStart"/>
-            <w:r>
-              <w:rPr>
-                <w:rFonts w:cstheme="minorHAnsi"/>
-                <w:color w:val="000000" w:themeColor="text1"/>
-                <w:lang w:val="es-AR"/>
-              </w:rPr>
-              <w:t>tr</w:t>
-            </w:r>
-            <w:proofErr w:type="spellEnd"/>
-            <w:r>
-              <w:rPr>
-                <w:rFonts w:cstheme="minorHAnsi"/>
-                <w:color w:val="000000" w:themeColor="text1"/>
-                <w:lang w:val="es-AR"/>
-              </w:rPr>
-              <w:t xml:space="preserve"> </w:t>
-            </w:r>
-            <w:proofErr w:type="spellStart"/>
-            <w:r>
-              <w:rPr>
-                <w:rFonts w:cstheme="minorHAnsi"/>
-                <w:color w:val="000000" w:themeColor="text1"/>
-                <w:lang w:val="es-AR"/>
-              </w:rPr>
-              <w:t>for</w:t>
-            </w:r>
-            <w:proofErr w:type="spellEnd"/>
-            <w:r>
-              <w:rPr>
-                <w:rFonts w:cstheme="minorHAnsi"/>
-                <w:color w:val="000000" w:themeColor="text1"/>
-                <w:lang w:val="es-AR"/>
-              </w:rPr>
-              <w:t xml:space="preserve"> </w:t>
-            </w:r>
-            <w:proofErr w:type="spellStart"/>
-            <w:r>
-              <w:rPr>
-                <w:rFonts w:cstheme="minorHAnsi"/>
-                <w:color w:val="000000" w:themeColor="text1"/>
-                <w:lang w:val="es-AR"/>
-              </w:rPr>
-              <w:t>item</w:t>
-            </w:r>
-            <w:proofErr w:type="spellEnd"/>
-            <w:r>
-              <w:rPr>
-                <w:rFonts w:cstheme="minorHAnsi"/>
-                <w:color w:val="000000" w:themeColor="text1"/>
-                <w:lang w:val="es-AR"/>
-              </w:rPr>
-              <w:t xml:space="preserve"> in </w:t>
-            </w:r>
-            <w:proofErr w:type="spellStart"/>
-            <w:r>
-              <w:rPr>
-                <w:rFonts w:cstheme="minorHAnsi"/>
-                <w:color w:val="000000" w:themeColor="text1"/>
-                <w:lang w:val="es-AR"/>
-              </w:rPr>
-              <w:t>horas_trabajadas_list</w:t>
-            </w:r>
-            <w:proofErr w:type="spellEnd"/>
-            <w:r>
-              <w:rPr>
-                <w:rFonts w:cstheme="minorHAnsi"/>
-                <w:color w:val="000000" w:themeColor="text1"/>
-                <w:lang w:val="es-AR"/>
-              </w:rPr>
-              <w:t xml:space="preserve"> %}</w:t>
+              <w:t>{%tr for item in horas_trabajadas_list %}</w:t>
             </w:r>
           </w:p>
         </w:tc>
@@ -400,25 +308,7 @@
                 <w:rFonts w:cstheme="minorHAnsi"/>
                 <w:lang w:val="es-AR"/>
               </w:rPr>
-              <w:t>{{</w:t>
-            </w:r>
-            <w:proofErr w:type="spellStart"/>
-            <w:proofErr w:type="gramStart"/>
-            <w:r>
-              <w:rPr>
-                <w:rFonts w:cstheme="minorHAnsi"/>
-                <w:lang w:val="es-AR"/>
-              </w:rPr>
-              <w:t>item.Fecha</w:t>
-            </w:r>
-            <w:proofErr w:type="spellEnd"/>
-            <w:proofErr w:type="gramEnd"/>
-            <w:r>
-              <w:rPr>
-                <w:rFonts w:cstheme="minorHAnsi"/>
-                <w:lang w:val="es-AR"/>
-              </w:rPr>
-              <w:t>}}</w:t>
+              <w:t>{{item.Fecha}}</w:t>
             </w:r>
           </w:p>
         </w:tc>
@@ -440,25 +330,7 @@
                 <w:rFonts w:cstheme="minorHAnsi"/>
                 <w:lang w:val="es-AR"/>
               </w:rPr>
-              <w:t>{{</w:t>
-            </w:r>
-            <w:proofErr w:type="spellStart"/>
-            <w:proofErr w:type="gramStart"/>
-            <w:r>
-              <w:rPr>
-                <w:rFonts w:cstheme="minorHAnsi"/>
-                <w:lang w:val="es-AR"/>
-              </w:rPr>
-              <w:t>item.Entrada</w:t>
-            </w:r>
-            <w:proofErr w:type="spellEnd"/>
-            <w:proofErr w:type="gramEnd"/>
-            <w:r>
-              <w:rPr>
-                <w:rFonts w:cstheme="minorHAnsi"/>
-                <w:lang w:val="es-AR"/>
-              </w:rPr>
-              <w:t>}}</w:t>
+              <w:t>{{item.Entrada}}</w:t>
             </w:r>
           </w:p>
         </w:tc>
@@ -480,25 +352,7 @@
                 <w:rFonts w:cstheme="minorHAnsi"/>
                 <w:lang w:val="es-AR"/>
               </w:rPr>
-              <w:t>{{</w:t>
-            </w:r>
-            <w:proofErr w:type="spellStart"/>
-            <w:proofErr w:type="gramStart"/>
-            <w:r>
-              <w:rPr>
-                <w:rFonts w:cstheme="minorHAnsi"/>
-                <w:lang w:val="es-AR"/>
-              </w:rPr>
-              <w:t>item.Salida</w:t>
-            </w:r>
-            <w:proofErr w:type="spellEnd"/>
-            <w:proofErr w:type="gramEnd"/>
-            <w:r>
-              <w:rPr>
-                <w:rFonts w:cstheme="minorHAnsi"/>
-                <w:lang w:val="es-AR"/>
-              </w:rPr>
-              <w:t>}}</w:t>
+              <w:t>{{item.Salida}}</w:t>
             </w:r>
           </w:p>
         </w:tc>
@@ -518,23 +372,7 @@
               <w:rPr>
                 <w:rFonts w:cstheme="minorHAnsi"/>
               </w:rPr>
-              <w:t>{{</w:t>
-            </w:r>
-            <w:proofErr w:type="spellStart"/>
-            <w:proofErr w:type="gramStart"/>
-            <w:r>
-              <w:rPr>
-                <w:rFonts w:cstheme="minorHAnsi"/>
-              </w:rPr>
-              <w:t>item.Detalle</w:t>
-            </w:r>
-            <w:proofErr w:type="spellEnd"/>
-            <w:proofErr w:type="gramEnd"/>
-            <w:r>
-              <w:rPr>
-                <w:rFonts w:cstheme="minorHAnsi"/>
-              </w:rPr>
-              <w:t>}}</w:t>
+              <w:t>{{item.Detalle}}</w:t>
             </w:r>
           </w:p>
         </w:tc>
@@ -560,25 +398,7 @@
                 <w:rFonts w:cstheme="minorHAnsi"/>
                 <w:lang w:val="es-AR"/>
               </w:rPr>
-              <w:t>{{</w:t>
-            </w:r>
-            <w:proofErr w:type="spellStart"/>
-            <w:proofErr w:type="gramStart"/>
-            <w:r>
-              <w:rPr>
-                <w:rFonts w:cstheme="minorHAnsi"/>
-                <w:lang w:val="es-AR"/>
-              </w:rPr>
-              <w:t>item.Trabajo</w:t>
-            </w:r>
-            <w:proofErr w:type="spellEnd"/>
-            <w:proofErr w:type="gramEnd"/>
-            <w:r>
-              <w:rPr>
-                <w:rFonts w:cstheme="minorHAnsi"/>
-                <w:lang w:val="es-AR"/>
-              </w:rPr>
-              <w:t>}}</w:t>
+              <w:t>{{item.Trabajo}}</w:t>
             </w:r>
           </w:p>
         </w:tc>
@@ -607,43 +427,7 @@
                 <w:color w:val="000000" w:themeColor="text1"/>
                 <w:lang w:val="es-AR"/>
               </w:rPr>
-              <w:t>{%</w:t>
-            </w:r>
-            <w:proofErr w:type="spellStart"/>
-            <w:r>
-              <w:rPr>
-                <w:rFonts w:cstheme="minorHAnsi"/>
-                <w:color w:val="000000" w:themeColor="text1"/>
-                <w:lang w:val="es-AR"/>
-              </w:rPr>
-              <w:t>tr</w:t>
-            </w:r>
-            <w:proofErr w:type="spellEnd"/>
-            <w:r>
-              <w:rPr>
-                <w:rFonts w:cstheme="minorHAnsi"/>
-                <w:color w:val="000000" w:themeColor="text1"/>
-                <w:lang w:val="es-AR"/>
-              </w:rPr>
-              <w:t xml:space="preserve"> </w:t>
-            </w:r>
-            <w:proofErr w:type="spellStart"/>
-            <w:r>
-              <w:rPr>
-                <w:rFonts w:cstheme="minorHAnsi"/>
-                <w:color w:val="000000" w:themeColor="text1"/>
-                <w:lang w:val="es-AR"/>
-              </w:rPr>
-              <w:t>endfor</w:t>
-            </w:r>
-            <w:proofErr w:type="spellEnd"/>
-            <w:r>
-              <w:rPr>
-                <w:rFonts w:cstheme="minorHAnsi"/>
-                <w:color w:val="000000" w:themeColor="text1"/>
-                <w:lang w:val="es-AR"/>
-              </w:rPr>
-              <w:t xml:space="preserve"> %}</w:t>
+              <w:t>{%tr endfor %}</w:t>
             </w:r>
           </w:p>
         </w:tc>
@@ -666,23 +450,13 @@
                 <w:lang w:val="es-AR"/>
               </w:rPr>
             </w:pPr>
-            <w:proofErr w:type="gramStart"/>
             <w:r>
               <w:rPr>
                 <w:rFonts w:cstheme="minorHAnsi"/>
                 <w:b/>
                 <w:lang w:val="es-AR"/>
               </w:rPr>
-              <w:t>TOTAL</w:t>
-            </w:r>
-            <w:proofErr w:type="gramEnd"/>
-            <w:r>
-              <w:rPr>
-                <w:rFonts w:cstheme="minorHAnsi"/>
-                <w:b/>
-                <w:lang w:val="es-AR"/>
-              </w:rPr>
-              <w:t xml:space="preserve"> DE HORAS TRABAJADAS: </w:t>
+              <w:t xml:space="preserve">TOTAL DE HORAS TRABAJADAS: </w:t>
             </w:r>
           </w:p>
         </w:tc>
@@ -716,21 +490,12 @@
               </w:rPr>
               <w:t xml:space="preserve">r </w:t>
             </w:r>
-            <w:proofErr w:type="spellStart"/>
             <w:r>
               <w:rPr>
                 <w:rFonts w:cstheme="minorHAnsi"/>
                 <w:lang w:val="es-AR"/>
               </w:rPr>
-              <w:t>horas_trabajadas</w:t>
-            </w:r>
-            <w:proofErr w:type="spellEnd"/>
-            <w:r>
-              <w:rPr>
-                <w:rFonts w:cstheme="minorHAnsi"/>
-                <w:lang w:val="es-AR"/>
-              </w:rPr>
-              <w:t>}}</w:t>
+              <w:t>horas_trabajadas}}</w:t>
             </w:r>
           </w:p>
         </w:tc>
@@ -865,16 +630,6 @@
     </w:tbl>
     <w:p>
       <w:pPr>
-        <w:spacing w:before="240"/>
-        <w:rPr>
-          <w:rFonts w:cstheme="minorHAnsi"/>
-          <w:b/>
-          <w:bCs/>
-        </w:rPr>
-      </w:pPr>
-    </w:p>
-    <w:p>
-      <w:pPr>
         <w:rPr>
           <w:rFonts w:cstheme="minorHAnsi"/>
           <w:b/>
@@ -935,23 +690,7 @@
           <w:rFonts w:cstheme="minorHAnsi"/>
           <w:lang w:val="es-AR"/>
         </w:rPr>
-        <w:t xml:space="preserve"> {{</w:t>
-      </w:r>
-      <w:proofErr w:type="spellStart"/>
-      <w:r>
-        <w:rPr>
-          <w:rFonts w:cstheme="minorHAnsi"/>
-          <w:lang w:val="es-AR"/>
-        </w:rPr>
-        <w:t>horas_trabajadas</w:t>
-      </w:r>
-      <w:proofErr w:type="spellEnd"/>
-      <w:r>
-        <w:rPr>
-          <w:rFonts w:cstheme="minorHAnsi"/>
-          <w:lang w:val="es-AR"/>
-        </w:rPr>
-        <w:t>}}</w:t>
+        <w:t xml:space="preserve"> {{horas_trabajadas}}</w:t>
       </w:r>
     </w:p>
     <w:p>
@@ -976,23 +715,7 @@
           <w:rFonts w:cstheme="minorHAnsi"/>
           <w:lang w:val="es-AR"/>
         </w:rPr>
-        <w:t xml:space="preserve"> {{</w:t>
-      </w:r>
-      <w:proofErr w:type="spellStart"/>
-      <w:r>
-        <w:rPr>
-          <w:rFonts w:cstheme="minorHAnsi"/>
-          <w:lang w:val="es-AR"/>
-        </w:rPr>
-        <w:t>horas_minimas</w:t>
-      </w:r>
-      <w:proofErr w:type="spellEnd"/>
-      <w:r>
-        <w:rPr>
-          <w:rFonts w:cstheme="minorHAnsi"/>
-          <w:lang w:val="es-AR"/>
-        </w:rPr>
-        <w:t>}}</w:t>
+        <w:t xml:space="preserve"> {{horas_minimas}}</w:t>
       </w:r>
     </w:p>
     <w:p>
@@ -1146,9 +869,78 @@
           <w:bCs/>
           <w:lang w:val="es-AR"/>
         </w:rPr>
-        <w:t xml:space="preserve">4 </w:t>
-      </w:r>
-      <w:proofErr w:type="spellStart"/>
+        <w:t>4 hs</w:t>
+      </w:r>
+      <w:r>
+        <w:rPr>
+          <w:rFonts w:cstheme="minorHAnsi"/>
+          <w:b/>
+          <w:bCs/>
+          <w:lang w:val="es-AR"/>
+        </w:rPr>
+        <w:t xml:space="preserve"> trabajadas</w:t>
+      </w:r>
+      <w:r>
+        <w:rPr>
+          <w:rFonts w:cstheme="minorHAnsi"/>
+          <w:b/>
+          <w:bCs/>
+          <w:lang w:val="es-AR"/>
+        </w:rPr>
+        <w:t>:</w:t>
+      </w:r>
+      <w:r>
+        <w:rPr>
+          <w:rFonts w:cstheme="minorHAnsi"/>
+          <w:lang w:val="es-AR"/>
+        </w:rPr>
+        <w:t xml:space="preserve"> {{dias_bajos}}</w:t>
+      </w:r>
+    </w:p>
+    <w:p>
+      <w:pPr>
+        <w:spacing w:after="0"/>
+        <w:rPr>
+          <w:rFonts w:cstheme="minorHAnsi"/>
+          <w:lang w:val="es-AR"/>
+        </w:rPr>
+      </w:pPr>
+      <w:r>
+        <w:rPr>
+          <w:rFonts w:cstheme="minorHAnsi"/>
+          <w:b/>
+          <w:bCs/>
+          <w:lang w:val="es-AR"/>
+        </w:rPr>
+        <w:t xml:space="preserve">Días </w:t>
+      </w:r>
+      <w:r>
+        <w:rPr>
+          <w:rFonts w:cstheme="minorHAnsi"/>
+          <w:b/>
+          <w:bCs/>
+          <w:lang w:val="es-AR"/>
+        </w:rPr>
+        <w:t xml:space="preserve">&lt; </w:t>
+      </w:r>
+      <w:r>
+        <w:rPr>
+          <w:rFonts w:cstheme="minorHAnsi"/>
+          <w:b/>
+          <w:bCs/>
+          <w:lang w:val="es-AR"/>
+        </w:rPr>
+        <w:t>9</w:t>
+      </w:r>
+      <w:r>
+        <w:rPr>
+          <w:rFonts w:cstheme="minorHAnsi"/>
+          <w:b/>
+          <w:bCs/>
+          <w:lang w:val="es-AR"/>
+        </w:rPr>
+        <w:t xml:space="preserve"> </w:t>
+      </w:r>
       <w:r>
         <w:rPr>
           <w:rFonts w:cstheme="minorHAnsi"/>
@@ -1158,7 +950,6 @@
         </w:rPr>
         <w:t>hs</w:t>
       </w:r>
-      <w:proofErr w:type="spellEnd"/>
       <w:r>
         <w:rPr>
           <w:rFonts w:cstheme="minorHAnsi"/>
@@ -1182,23 +973,7 @@
           <w:rFonts w:cstheme="minorHAnsi"/>
           <w:lang w:val="es-AR"/>
         </w:rPr>
-        <w:t xml:space="preserve"> {{</w:t>
-      </w:r>
-      <w:proofErr w:type="spellStart"/>
-      <w:r>
-        <w:rPr>
-          <w:rFonts w:cstheme="minorHAnsi"/>
-          <w:lang w:val="es-AR"/>
-        </w:rPr>
-        <w:t>dias_bajos</w:t>
-      </w:r>
-      <w:proofErr w:type="spellEnd"/>
-      <w:r>
-        <w:rPr>
-          <w:rFonts w:cstheme="minorHAnsi"/>
-          <w:lang w:val="es-AR"/>
-        </w:rPr>
-        <w:t>}}</w:t>
+        <w:t xml:space="preserve"> {{dias_altos}}</w:t>
       </w:r>
     </w:p>
     <w:p>
@@ -1216,103 +991,6 @@
           <w:bCs/>
           <w:lang w:val="es-AR"/>
         </w:rPr>
-        <w:t xml:space="preserve">Días </w:t>
-      </w:r>
-      <w:r>
-        <w:rPr>
-          <w:rFonts w:cstheme="minorHAnsi"/>
-          <w:b/>
-          <w:bCs/>
-          <w:lang w:val="es-AR"/>
-        </w:rPr>
-        <w:t xml:space="preserve">&lt; </w:t>
-      </w:r>
-      <w:r>
-        <w:rPr>
-          <w:rFonts w:cstheme="minorHAnsi"/>
-          <w:b/>
-          <w:bCs/>
-          <w:lang w:val="es-AR"/>
-        </w:rPr>
-        <w:t>9</w:t>
-      </w:r>
-      <w:r>
-        <w:rPr>
-          <w:rFonts w:cstheme="minorHAnsi"/>
-          <w:b/>
-          <w:bCs/>
-          <w:lang w:val="es-AR"/>
-        </w:rPr>
-        <w:t xml:space="preserve"> </w:t>
-      </w:r>
-      <w:proofErr w:type="spellStart"/>
-      <w:r>
-        <w:rPr>
-          <w:rFonts w:cstheme="minorHAnsi"/>
-          <w:b/>
-          <w:bCs/>
-          <w:lang w:val="es-AR"/>
-        </w:rPr>
-        <w:t>hs</w:t>
-      </w:r>
-      <w:proofErr w:type="spellEnd"/>
-      <w:r>
-        <w:rPr>
-          <w:rFonts w:cstheme="minorHAnsi"/>
-          <w:b/>
-          <w:bCs/>
-          <w:lang w:val="es-AR"/>
-        </w:rPr>
-        <w:t xml:space="preserve"> trabajadas</w:t>
-      </w:r>
-      <w:r>
-        <w:rPr>
-          <w:rFonts w:cstheme="minorHAnsi"/>
-          <w:b/>
-          <w:bCs/>
-          <w:lang w:val="es-AR"/>
-        </w:rPr>
-        <w:t>:</w:t>
-      </w:r>
-      <w:r>
-        <w:rPr>
-          <w:rFonts w:cstheme="minorHAnsi"/>
-          <w:lang w:val="es-AR"/>
-        </w:rPr>
-        <w:t xml:space="preserve"> {{</w:t>
-      </w:r>
-      <w:proofErr w:type="spellStart"/>
-      <w:r>
-        <w:rPr>
-          <w:rFonts w:cstheme="minorHAnsi"/>
-          <w:lang w:val="es-AR"/>
-        </w:rPr>
-        <w:t>dias_altos</w:t>
-      </w:r>
-      <w:proofErr w:type="spellEnd"/>
-      <w:r>
-        <w:rPr>
-          <w:rFonts w:cstheme="minorHAnsi"/>
-          <w:lang w:val="es-AR"/>
-        </w:rPr>
-        <w:t>}}</w:t>
-      </w:r>
-    </w:p>
-    <w:p>
-      <w:pPr>
-        <w:spacing w:after="0"/>
-        <w:rPr>
-          <w:rFonts w:cstheme="minorHAnsi"/>
-          <w:lang w:val="es-AR"/>
-        </w:rPr>
-      </w:pPr>
-      <w:r>
-        <w:rPr>
-          <w:rFonts w:cstheme="minorHAnsi"/>
-          <w:b/>
-          <w:bCs/>
-          <w:lang w:val="es-AR"/>
-        </w:rPr>
         <w:t>Días con registro incompleto:</w:t>
       </w:r>
       <w:r>
@@ -1320,23 +998,7 @@
           <w:rFonts w:cstheme="minorHAnsi"/>
           <w:lang w:val="es-AR"/>
         </w:rPr>
-        <w:t xml:space="preserve"> {{</w:t>
-      </w:r>
-      <w:proofErr w:type="spellStart"/>
-      <w:r>
-        <w:rPr>
-          <w:rFonts w:cstheme="minorHAnsi"/>
-          <w:lang w:val="es-AR"/>
-        </w:rPr>
-        <w:t>faltas_registro</w:t>
-      </w:r>
-      <w:proofErr w:type="spellEnd"/>
-      <w:r>
-        <w:rPr>
-          <w:rFonts w:cstheme="minorHAnsi"/>
-          <w:lang w:val="es-AR"/>
-        </w:rPr>
-        <w:t>}}</w:t>
+        <w:t xml:space="preserve"> {{faltas_registro}}</w:t>
       </w:r>
     </w:p>
     <w:p>
@@ -1344,32 +1006,29 @@
         <w:spacing w:before="240"/>
         <w:rPr>
           <w:rFonts w:cstheme="minorHAnsi"/>
-          <w:b/>
-          <w:bCs/>
-          <w:lang w:val="es-AR"/>
-        </w:rPr>
-      </w:pPr>
-    </w:p>
-    <w:p>
-      <w:pPr>
-        <w:rPr>
-          <w:rFonts w:cstheme="minorHAnsi"/>
-          <w:b/>
-          <w:bCs/>
-        </w:rPr>
-      </w:pPr>
-      <w:r>
-        <w:rPr>
-          <w:rFonts w:cstheme="minorHAnsi"/>
-          <w:b/>
-          <w:bCs/>
-        </w:rPr>
-        <w:br w:type="page"/>
-      </w:r>
-    </w:p>
-    <w:p>
-      <w:pPr>
-        <w:spacing w:before="240"/>
+        </w:rPr>
+      </w:pPr>
+      <w:r>
+        <w:rPr>
+          <w:rFonts w:cstheme="minorHAnsi"/>
+        </w:rPr>
+        <w:t>{% if grafico</w:t>
+      </w:r>
+      <w:r>
+        <w:rPr>
+          <w:rFonts w:cstheme="minorHAnsi"/>
+        </w:rPr>
+        <w:t>1</w:t>
+      </w:r>
+      <w:r>
+        <w:rPr>
+          <w:rFonts w:cstheme="minorHAnsi"/>
+        </w:rPr>
+        <w:t xml:space="preserve"> %}</w:t>
+      </w:r>
+    </w:p>
+    <w:p>
+      <w:pPr>
         <w:rPr>
           <w:rFonts w:cstheme="minorHAnsi"/>
           <w:b/>
@@ -1386,10 +1045,78 @@
           <w:sz w:val="32"/>
           <w:szCs w:val="32"/>
         </w:rPr>
+        <w:br w:type="page"/>
+      </w:r>
+    </w:p>
+    <w:p>
+      <w:pPr>
+        <w:spacing w:before="240"/>
+        <w:rPr>
+          <w:rFonts w:cstheme="minorHAnsi"/>
+        </w:rPr>
+      </w:pPr>
+      <w:r>
+        <w:rPr>
+          <w:rFonts w:cstheme="minorHAnsi"/>
+        </w:rPr>
         <w:lastRenderedPageBreak/>
-        <w:t>HORAS</w:t>
-      </w:r>
-      <w:r>
+        <w:t>{{grafico</w:t>
+      </w:r>
+      <w:r>
+        <w:rPr>
+          <w:rFonts w:cstheme="minorHAnsi"/>
+        </w:rPr>
+        <w:t>1</w:t>
+      </w:r>
+      <w:r>
+        <w:rPr>
+          <w:rFonts w:cstheme="minorHAnsi"/>
+        </w:rPr>
+        <w:t>}}</w:t>
+      </w:r>
+    </w:p>
+    <w:p>
+      <w:pPr>
+        <w:spacing w:before="240"/>
+        <w:rPr>
+          <w:rFonts w:cstheme="minorHAnsi"/>
+        </w:rPr>
+      </w:pPr>
+      <w:r>
+        <w:rPr>
+          <w:rFonts w:cstheme="minorHAnsi"/>
+        </w:rPr>
+        <w:t>{% endif %}</w:t>
+      </w:r>
+    </w:p>
+    <w:p>
+      <w:pPr>
+        <w:spacing w:before="240"/>
+        <w:rPr>
+          <w:rFonts w:cstheme="minorHAnsi"/>
+        </w:rPr>
+      </w:pPr>
+      <w:r>
+        <w:rPr>
+          <w:rFonts w:cstheme="minorHAnsi"/>
+        </w:rPr>
+        <w:t>{% if grafico</w:t>
+      </w:r>
+      <w:r>
+        <w:rPr>
+          <w:rFonts w:cstheme="minorHAnsi"/>
+        </w:rPr>
+        <w:t>2</w:t>
+      </w:r>
+      <w:r>
+        <w:rPr>
+          <w:rFonts w:cstheme="minorHAnsi"/>
+        </w:rPr>
+        <w:t xml:space="preserve"> %}</w:t>
+      </w:r>
+    </w:p>
+    <w:p>
+      <w:pPr>
         <w:rPr>
           <w:rFonts w:cstheme="minorHAnsi"/>
           <w:b/>
@@ -1397,8 +1124,7 @@
           <w:sz w:val="32"/>
           <w:szCs w:val="32"/>
         </w:rPr>
-        <w:t xml:space="preserve"> TRABAJADAS</w:t>
-      </w:r>
+      </w:pPr>
       <w:r>
         <w:rPr>
           <w:rFonts w:cstheme="minorHAnsi"/>
@@ -1407,7 +1133,7 @@
           <w:sz w:val="32"/>
           <w:szCs w:val="32"/>
         </w:rPr>
-        <w:t xml:space="preserve"> POR DÍA</w:t>
+        <w:br w:type="page"/>
       </w:r>
     </w:p>
     <w:p>
@@ -1421,7 +1147,8 @@
         <w:rPr>
           <w:rFonts w:cstheme="minorHAnsi"/>
         </w:rPr>
-        <w:t>{{grafico}}</w:t>
+        <w:lastRenderedPageBreak/>
+        <w:t>{{grafico2}}</w:t>
       </w:r>
     </w:p>
     <w:p>
@@ -1431,27 +1158,41 @@
           <w:rFonts w:cstheme="minorHAnsi"/>
         </w:rPr>
       </w:pPr>
-    </w:p>
-    <w:p>
-      <w:pPr>
-        <w:rPr>
-          <w:rFonts w:cstheme="minorHAnsi"/>
-          <w:b/>
-          <w:bCs/>
-        </w:rPr>
-      </w:pPr>
-      <w:r>
-        <w:rPr>
-          <w:rFonts w:cstheme="minorHAnsi"/>
-          <w:b/>
-          <w:bCs/>
-        </w:rPr>
-        <w:br w:type="page"/>
+      <w:r>
+        <w:rPr>
+          <w:rFonts w:cstheme="minorHAnsi"/>
+        </w:rPr>
+        <w:t>{% endif %}</w:t>
       </w:r>
     </w:p>
     <w:p>
       <w:pPr>
         <w:spacing w:before="240"/>
+        <w:rPr>
+          <w:rFonts w:cstheme="minorHAnsi"/>
+        </w:rPr>
+      </w:pPr>
+      <w:r>
+        <w:rPr>
+          <w:rFonts w:cstheme="minorHAnsi"/>
+        </w:rPr>
+        <w:t>{% if grafico</w:t>
+      </w:r>
+      <w:r>
+        <w:rPr>
+          <w:rFonts w:cstheme="minorHAnsi"/>
+        </w:rPr>
+        <w:t>3</w:t>
+      </w:r>
+      <w:r>
+        <w:rPr>
+          <w:rFonts w:cstheme="minorHAnsi"/>
+        </w:rPr>
+        <w:t xml:space="preserve"> %}</w:t>
+      </w:r>
+    </w:p>
+    <w:p>
+      <w:pPr>
         <w:rPr>
           <w:rFonts w:cstheme="minorHAnsi"/>
           <w:b/>
@@ -1468,10 +1209,66 @@
           <w:sz w:val="32"/>
           <w:szCs w:val="32"/>
         </w:rPr>
+        <w:br w:type="page"/>
+      </w:r>
+    </w:p>
+    <w:p>
+      <w:pPr>
+        <w:spacing w:before="240"/>
+        <w:rPr>
+          <w:rFonts w:cstheme="minorHAnsi"/>
+        </w:rPr>
+      </w:pPr>
+      <w:r>
+        <w:rPr>
+          <w:rFonts w:cstheme="minorHAnsi"/>
+        </w:rPr>
         <w:lastRenderedPageBreak/>
-        <w:t xml:space="preserve">PROMEDIO </w:t>
-      </w:r>
-      <w:r>
+        <w:t>{{grafico3}}</w:t>
+      </w:r>
+    </w:p>
+    <w:p>
+      <w:pPr>
+        <w:spacing w:before="240"/>
+        <w:rPr>
+          <w:rFonts w:cstheme="minorHAnsi"/>
+        </w:rPr>
+      </w:pPr>
+      <w:r>
+        <w:rPr>
+          <w:rFonts w:cstheme="minorHAnsi"/>
+        </w:rPr>
+        <w:t>{% endif %}</w:t>
+      </w:r>
+    </w:p>
+    <w:p>
+      <w:pPr>
+        <w:spacing w:before="240"/>
+        <w:rPr>
+          <w:rFonts w:cstheme="minorHAnsi"/>
+        </w:rPr>
+      </w:pPr>
+      <w:r>
+        <w:rPr>
+          <w:rFonts w:cstheme="minorHAnsi"/>
+        </w:rPr>
+        <w:t>{% if grafico</w:t>
+      </w:r>
+      <w:r>
+        <w:rPr>
+          <w:rFonts w:cstheme="minorHAnsi"/>
+        </w:rPr>
+        <w:t>4</w:t>
+      </w:r>
+      <w:r>
+        <w:rPr>
+          <w:rFonts w:cstheme="minorHAnsi"/>
+        </w:rPr>
+        <w:t xml:space="preserve"> %}</w:t>
+      </w:r>
+    </w:p>
+    <w:p>
+      <w:pPr>
         <w:rPr>
           <w:rFonts w:cstheme="minorHAnsi"/>
           <w:b/>
@@ -1479,8 +1276,7 @@
           <w:sz w:val="32"/>
           <w:szCs w:val="32"/>
         </w:rPr>
-        <w:t xml:space="preserve">DE HORAS TRABAJADAS </w:t>
-      </w:r>
+      </w:pPr>
       <w:r>
         <w:rPr>
           <w:rFonts w:cstheme="minorHAnsi"/>
@@ -1489,7 +1285,7 @@
           <w:sz w:val="32"/>
           <w:szCs w:val="32"/>
         </w:rPr>
-        <w:t>POR DÍA DE SEMANA</w:t>
+        <w:br w:type="page"/>
       </w:r>
     </w:p>
     <w:p>
@@ -1503,7 +1299,20 @@
         <w:rPr>
           <w:rFonts w:cstheme="minorHAnsi"/>
         </w:rPr>
-        <w:t>{{grafico2}}</w:t>
+        <w:lastRenderedPageBreak/>
+        <w:t>{{grafico</w:t>
+      </w:r>
+      <w:r>
+        <w:rPr>
+          <w:rFonts w:cstheme="minorHAnsi"/>
+        </w:rPr>
+        <w:t>4</w:t>
+      </w:r>
+      <w:r>
+        <w:rPr>
+          <w:rFonts w:cstheme="minorHAnsi"/>
+        </w:rPr>
+        <w:t>}}</w:t>
       </w:r>
     </w:p>
     <w:p>
@@ -1513,59 +1322,11 @@
           <w:rFonts w:cstheme="minorHAnsi"/>
         </w:rPr>
       </w:pPr>
-    </w:p>
-    <w:p>
-      <w:pPr>
-        <w:rPr>
-          <w:rFonts w:cstheme="minorHAnsi"/>
-          <w:b/>
-          <w:bCs/>
-        </w:rPr>
-      </w:pPr>
-      <w:r>
-        <w:rPr>
-          <w:rFonts w:cstheme="minorHAnsi"/>
-          <w:b/>
-          <w:bCs/>
-        </w:rPr>
-        <w:br w:type="page"/>
-      </w:r>
-    </w:p>
-    <w:p>
-      <w:pPr>
-        <w:spacing w:before="240"/>
-        <w:rPr>
-          <w:rFonts w:cstheme="minorHAnsi"/>
-          <w:b/>
-          <w:bCs/>
-          <w:sz w:val="32"/>
-          <w:szCs w:val="32"/>
-        </w:rPr>
-      </w:pPr>
-      <w:r>
-        <w:rPr>
-          <w:rFonts w:cstheme="minorHAnsi"/>
-          <w:b/>
-          <w:bCs/>
-          <w:sz w:val="32"/>
-          <w:szCs w:val="32"/>
-        </w:rPr>
-        <w:lastRenderedPageBreak/>
-        <w:t>DISTRIBUCION DE HORAS (HISTOGRAMA)</w:t>
-      </w:r>
-    </w:p>
-    <w:p>
-      <w:pPr>
-        <w:spacing w:before="240"/>
-        <w:rPr>
-          <w:rFonts w:cstheme="minorHAnsi"/>
-        </w:rPr>
-      </w:pPr>
-      <w:r>
-        <w:rPr>
-          <w:rFonts w:cstheme="minorHAnsi"/>
-        </w:rPr>
-        <w:t>{{grafico3}}</w:t>
+      <w:r>
+        <w:rPr>
+          <w:rFonts w:cstheme="minorHAnsi"/>
+        </w:rPr>
+        <w:t>{% endif %}</w:t>
       </w:r>
     </w:p>
     <w:p>

</xml_diff>